<commit_message>
Actualiza el reporte con los datos del estudiante
</commit_message>
<xml_diff>
--- a/Reporte_Practica05.docx
+++ b/Reporte_Practica05.docx
@@ -5,99 +5,189 @@
     <w:p>
       <w:pPr>
         <w:spacing w:after="60"/>
-      </w:pPr>
-      <w:r>
-        <w:rPr>
-          <w:b/>
-          <w:bCs/>
-          <w:color w:val="1F3A4D"/>
-          <w:sz w:val="40"/>
-          <w:szCs w:val="40"/>
-        </w:rPr>
-        <w:t>Práctica N.° 5: Unity 6 + XR</w:t>
-      </w:r>
-    </w:p>
-    <w:p>
-      <w:pPr>
-        <w:spacing w:after="160"/>
-      </w:pPr>
-      <w:r>
-        <w:rPr>
-          <w:i/>
-          <w:iCs/>
-          <w:sz w:val="26"/>
-          <w:szCs w:val="26"/>
-        </w:rPr>
-        <w:t>Escena inmersiva con iluminación pre-calculada y audio espacial</w:t>
-      </w:r>
-    </w:p>
-    <w:p>
-      <w:pPr>
-        <w:spacing w:after="120" w:line="300" w:lineRule="auto"/>
-      </w:pPr>
-      <w:r>
-        <w:rPr>
-          <w:color w:val="555555"/>
-          <w:sz w:val="20"/>
-          <w:szCs w:val="20"/>
-        </w:rPr>
-        <w:t>Universidad Autónoma del Perú | Laboratorio XR</w:t>
-      </w:r>
-    </w:p>
-    <w:p>
-      <w:pPr>
-        <w:spacing w:after="120" w:line="300" w:lineRule="auto"/>
-      </w:pPr>
-      <w:r>
-        <w:rPr>
-          <w:b/>
-          <w:bCs/>
+        <w:rPr>
+          <w:rFonts w:ascii="Arial" w:hAnsi="Arial" w:cs="Arial"/>
+          <w:sz w:val="18"/>
+          <w:szCs w:val="18"/>
+        </w:rPr>
+      </w:pPr>
+      <w:r>
+        <w:rPr>
+          <w:rFonts w:ascii="Arial" w:hAnsi="Arial" w:cs="Arial"/>
+          <w:b/>
+          <w:bCs/>
+          <w:sz w:val="32"/>
+          <w:szCs w:val="32"/>
+        </w:rPr>
+        <w:t xml:space="preserve">Práctica </w:t>
+      </w:r>
+      <w:proofErr w:type="spellStart"/>
+      <w:r>
+        <w:rPr>
+          <w:rFonts w:ascii="Arial" w:hAnsi="Arial" w:cs="Arial"/>
+          <w:b/>
+          <w:bCs/>
+          <w:sz w:val="32"/>
+          <w:szCs w:val="32"/>
+        </w:rPr>
+        <w:t>N.°</w:t>
+      </w:r>
+      <w:proofErr w:type="spellEnd"/>
+      <w:r>
+        <w:rPr>
+          <w:rFonts w:ascii="Arial" w:hAnsi="Arial" w:cs="Arial"/>
+          <w:b/>
+          <w:bCs/>
+          <w:sz w:val="32"/>
+          <w:szCs w:val="32"/>
+        </w:rPr>
+        <w:t xml:space="preserve"> 5: Unity 6 + XR</w:t>
+      </w:r>
+      <w:r>
+        <w:rPr>
+          <w:rFonts w:ascii="Arial" w:hAnsi="Arial" w:cs="Arial"/>
+          <w:b/>
+          <w:bCs/>
+          <w:sz w:val="32"/>
+          <w:szCs w:val="32"/>
+        </w:rPr>
+        <w:br/>
+      </w:r>
+    </w:p>
+    <w:p>
+      <w:pPr>
+        <w:spacing w:line="360" w:lineRule="auto"/>
+        <w:rPr>
+          <w:rFonts w:ascii="Arial" w:hAnsi="Arial" w:cs="Arial"/>
+          <w:sz w:val="24"/>
+          <w:szCs w:val="24"/>
+        </w:rPr>
+      </w:pPr>
+      <w:r>
+        <w:rPr>
+          <w:rFonts w:ascii="Arial" w:hAnsi="Arial" w:cs="Arial"/>
+          <w:b/>
+          <w:bCs/>
+          <w:sz w:val="24"/>
+          <w:szCs w:val="24"/>
         </w:rPr>
         <w:t xml:space="preserve">Estudiante: </w:t>
       </w:r>
       <w:r>
-        <w:t>[escribe tu nombre completo]</w:t>
-      </w:r>
-    </w:p>
-    <w:p>
-      <w:pPr>
-        <w:spacing w:after="120" w:line="300" w:lineRule="auto"/>
-      </w:pPr>
-      <w:r>
-        <w:rPr>
-          <w:b/>
-          <w:bCs/>
-        </w:rPr>
-        <w:t xml:space="preserve">Curso / sección: </w:t>
-      </w:r>
-      <w:r>
-        <w:t>[completa]</w:t>
-      </w:r>
-      <w:r>
-        <w:rPr>
-          <w:b/>
-          <w:bCs/>
-        </w:rPr>
-        <w:t xml:space="preserve">      Fecha: </w:t>
-      </w:r>
-      <w:r>
-        <w:t>07/10/2026</w:t>
+        <w:rPr>
+          <w:rFonts w:ascii="Arial" w:hAnsi="Arial" w:cs="Arial"/>
+          <w:sz w:val="24"/>
+          <w:szCs w:val="24"/>
+        </w:rPr>
+        <w:t>PITTMAN MEDINA EDWARD</w:t>
+      </w:r>
+    </w:p>
+    <w:p>
+      <w:pPr>
+        <w:spacing w:line="360" w:lineRule="auto"/>
+        <w:rPr>
+          <w:rFonts w:ascii="Arial" w:hAnsi="Arial" w:cs="Arial"/>
+          <w:sz w:val="24"/>
+          <w:szCs w:val="24"/>
+        </w:rPr>
+      </w:pPr>
+      <w:r>
+        <w:rPr>
+          <w:rFonts w:ascii="Arial" w:hAnsi="Arial" w:cs="Arial"/>
+          <w:b/>
+          <w:bCs/>
+          <w:sz w:val="24"/>
+          <w:szCs w:val="24"/>
+        </w:rPr>
+        <w:t xml:space="preserve">Curso: </w:t>
+      </w:r>
+      <w:r>
+        <w:rPr>
+          <w:rFonts w:ascii="Arial" w:hAnsi="Arial" w:cs="Arial"/>
+          <w:b/>
+          <w:bCs/>
+          <w:sz w:val="24"/>
+          <w:szCs w:val="24"/>
+        </w:rPr>
+        <w:t>L</w:t>
+      </w:r>
+      <w:r>
+        <w:rPr>
+          <w:rFonts w:ascii="Arial" w:hAnsi="Arial" w:cs="Arial"/>
+          <w:sz w:val="24"/>
+          <w:szCs w:val="24"/>
+        </w:rPr>
+        <w:t>aboratorio de realidad extendida (</w:t>
+      </w:r>
+      <w:proofErr w:type="spellStart"/>
+      <w:r>
+        <w:rPr>
+          <w:rFonts w:ascii="Arial" w:hAnsi="Arial" w:cs="Arial"/>
+          <w:sz w:val="24"/>
+          <w:szCs w:val="24"/>
+        </w:rPr>
+        <w:t>xr</w:t>
+      </w:r>
+      <w:proofErr w:type="spellEnd"/>
+      <w:r>
+        <w:rPr>
+          <w:rFonts w:ascii="Arial" w:hAnsi="Arial" w:cs="Arial"/>
+          <w:sz w:val="24"/>
+          <w:szCs w:val="24"/>
+        </w:rPr>
+        <w:t>) para videojuegos</w:t>
+      </w:r>
+      <w:r>
+        <w:rPr>
+          <w:rFonts w:ascii="Arial" w:hAnsi="Arial" w:cs="Arial"/>
+          <w:sz w:val="24"/>
+          <w:szCs w:val="24"/>
+        </w:rPr>
+        <w:t xml:space="preserve"> </w:t>
+      </w:r>
+      <w:r>
+        <w:rPr>
+          <w:rFonts w:ascii="Arial" w:hAnsi="Arial" w:cs="Arial"/>
+          <w:b/>
+          <w:bCs/>
+          <w:sz w:val="24"/>
+          <w:szCs w:val="24"/>
+        </w:rPr>
+        <w:t xml:space="preserve">  </w:t>
       </w:r>
     </w:p>
     <w:p>
       <w:pPr>
         <w:pStyle w:val="Ttulo1"/>
-        <w:spacing w:before="280" w:after="120"/>
-      </w:pPr>
-      <w:r>
-        <w:rPr>
-          <w:b/>
-          <w:bCs/>
-          <w:color w:val="1F3A4D"/>
-          <w:sz w:val="28"/>
-          <w:szCs w:val="28"/>
-        </w:rPr>
-        <w:t>1. Resumen de resultados</w:t>
+        <w:spacing w:line="360" w:lineRule="auto"/>
+        <w:rPr>
+          <w:rFonts w:ascii="Arial" w:hAnsi="Arial" w:cs="Arial"/>
+          <w:color w:val="auto"/>
+          <w:sz w:val="24"/>
+          <w:szCs w:val="24"/>
+        </w:rPr>
+      </w:pPr>
+      <w:r>
+        <w:rPr>
+          <w:rFonts w:ascii="Arial" w:hAnsi="Arial" w:cs="Arial"/>
+          <w:b/>
+          <w:bCs/>
+          <w:color w:val="auto"/>
+          <w:sz w:val="24"/>
+          <w:szCs w:val="24"/>
+        </w:rPr>
+        <w:t xml:space="preserve">1. </w:t>
+      </w:r>
+      <w:r>
+        <w:rPr>
+          <w:rFonts w:ascii="Arial" w:hAnsi="Arial" w:cs="Arial"/>
+          <w:b/>
+          <w:bCs/>
+          <w:color w:val="auto"/>
+          <w:sz w:val="24"/>
+          <w:szCs w:val="24"/>
+        </w:rPr>
+        <w:t>RESUMEN DE RESULTADOS</w:t>
       </w:r>
     </w:p>
     <w:tbl>
@@ -136,10 +226,21 @@
             </w:tcMar>
           </w:tcPr>
           <w:p>
+            <w:pPr>
+              <w:spacing w:line="360" w:lineRule="auto"/>
+              <w:rPr>
+                <w:rFonts w:ascii="Arial" w:hAnsi="Arial" w:cs="Arial"/>
+                <w:sz w:val="24"/>
+                <w:szCs w:val="24"/>
+              </w:rPr>
+            </w:pPr>
             <w:r>
               <w:rPr>
+                <w:rFonts w:ascii="Arial" w:hAnsi="Arial" w:cs="Arial"/>
                 <w:b/>
                 <w:bCs/>
+                <w:sz w:val="24"/>
+                <w:szCs w:val="24"/>
               </w:rPr>
               <w:t>Proyecto</w:t>
             </w:r>
@@ -162,7 +263,20 @@
             </w:tcMar>
           </w:tcPr>
           <w:p>
+            <w:pPr>
+              <w:spacing w:line="360" w:lineRule="auto"/>
+              <w:rPr>
+                <w:rFonts w:ascii="Arial" w:hAnsi="Arial" w:cs="Arial"/>
+                <w:sz w:val="24"/>
+                <w:szCs w:val="24"/>
+              </w:rPr>
+            </w:pPr>
             <w:r>
+              <w:rPr>
+                <w:rFonts w:ascii="Arial" w:hAnsi="Arial" w:cs="Arial"/>
+                <w:sz w:val="24"/>
+                <w:szCs w:val="24"/>
+              </w:rPr>
               <w:t>Practica05_XR_Inmersion</w:t>
             </w:r>
           </w:p>
@@ -187,10 +301,21 @@
             </w:tcMar>
           </w:tcPr>
           <w:p>
+            <w:pPr>
+              <w:spacing w:line="360" w:lineRule="auto"/>
+              <w:rPr>
+                <w:rFonts w:ascii="Arial" w:hAnsi="Arial" w:cs="Arial"/>
+                <w:sz w:val="24"/>
+                <w:szCs w:val="24"/>
+              </w:rPr>
+            </w:pPr>
             <w:r>
               <w:rPr>
+                <w:rFonts w:ascii="Arial" w:hAnsi="Arial" w:cs="Arial"/>
                 <w:b/>
                 <w:bCs/>
+                <w:sz w:val="24"/>
+                <w:szCs w:val="24"/>
               </w:rPr>
               <w:t>Editor / pipeline</w:t>
             </w:r>
@@ -213,7 +338,20 @@
             </w:tcMar>
           </w:tcPr>
           <w:p>
+            <w:pPr>
+              <w:spacing w:line="360" w:lineRule="auto"/>
+              <w:rPr>
+                <w:rFonts w:ascii="Arial" w:hAnsi="Arial" w:cs="Arial"/>
+                <w:sz w:val="24"/>
+                <w:szCs w:val="24"/>
+              </w:rPr>
+            </w:pPr>
             <w:r>
+              <w:rPr>
+                <w:rFonts w:ascii="Arial" w:hAnsi="Arial" w:cs="Arial"/>
+                <w:sz w:val="24"/>
+                <w:szCs w:val="24"/>
+              </w:rPr>
               <w:t>Unity 6.4 (6000.4.2f1), Universal Render Pipeline (URP)</w:t>
             </w:r>
           </w:p>
@@ -238,10 +376,21 @@
             </w:tcMar>
           </w:tcPr>
           <w:p>
+            <w:pPr>
+              <w:spacing w:line="360" w:lineRule="auto"/>
+              <w:rPr>
+                <w:rFonts w:ascii="Arial" w:hAnsi="Arial" w:cs="Arial"/>
+                <w:sz w:val="24"/>
+                <w:szCs w:val="24"/>
+              </w:rPr>
+            </w:pPr>
             <w:r>
               <w:rPr>
+                <w:rFonts w:ascii="Arial" w:hAnsi="Arial" w:cs="Arial"/>
                 <w:b/>
                 <w:bCs/>
+                <w:sz w:val="24"/>
+                <w:szCs w:val="24"/>
               </w:rPr>
               <w:t>XR</w:t>
             </w:r>
@@ -264,8 +413,75 @@
             </w:tcMar>
           </w:tcPr>
           <w:p>
+            <w:pPr>
+              <w:spacing w:line="360" w:lineRule="auto"/>
+              <w:rPr>
+                <w:rFonts w:ascii="Arial" w:hAnsi="Arial" w:cs="Arial"/>
+                <w:sz w:val="24"/>
+                <w:szCs w:val="24"/>
+              </w:rPr>
+            </w:pPr>
             <w:r>
-              <w:t>XR Interaction Toolkit 3.2.1 + XR Device Simulator (prueba en PC, sin visor)</w:t>
+              <w:rPr>
+                <w:rFonts w:ascii="Arial" w:hAnsi="Arial" w:cs="Arial"/>
+                <w:sz w:val="24"/>
+                <w:szCs w:val="24"/>
+              </w:rPr>
+              <w:t xml:space="preserve">XR </w:t>
+            </w:r>
+            <w:proofErr w:type="spellStart"/>
+            <w:r>
+              <w:rPr>
+                <w:rFonts w:ascii="Arial" w:hAnsi="Arial" w:cs="Arial"/>
+                <w:sz w:val="24"/>
+                <w:szCs w:val="24"/>
+              </w:rPr>
+              <w:t>Interaction</w:t>
+            </w:r>
+            <w:proofErr w:type="spellEnd"/>
+            <w:r>
+              <w:rPr>
+                <w:rFonts w:ascii="Arial" w:hAnsi="Arial" w:cs="Arial"/>
+                <w:sz w:val="24"/>
+                <w:szCs w:val="24"/>
+              </w:rPr>
+              <w:t xml:space="preserve"> </w:t>
+            </w:r>
+            <w:proofErr w:type="spellStart"/>
+            <w:r>
+              <w:rPr>
+                <w:rFonts w:ascii="Arial" w:hAnsi="Arial" w:cs="Arial"/>
+                <w:sz w:val="24"/>
+                <w:szCs w:val="24"/>
+              </w:rPr>
+              <w:t>Toolkit</w:t>
+            </w:r>
+            <w:proofErr w:type="spellEnd"/>
+            <w:r>
+              <w:rPr>
+                <w:rFonts w:ascii="Arial" w:hAnsi="Arial" w:cs="Arial"/>
+                <w:sz w:val="24"/>
+                <w:szCs w:val="24"/>
+              </w:rPr>
+              <w:t xml:space="preserve"> 3.2.1 + XR </w:t>
+            </w:r>
+            <w:proofErr w:type="spellStart"/>
+            <w:r>
+              <w:rPr>
+                <w:rFonts w:ascii="Arial" w:hAnsi="Arial" w:cs="Arial"/>
+                <w:sz w:val="24"/>
+                <w:szCs w:val="24"/>
+              </w:rPr>
+              <w:t>Device</w:t>
+            </w:r>
+            <w:proofErr w:type="spellEnd"/>
+            <w:r>
+              <w:rPr>
+                <w:rFonts w:ascii="Arial" w:hAnsi="Arial" w:cs="Arial"/>
+                <w:sz w:val="24"/>
+                <w:szCs w:val="24"/>
+              </w:rPr>
+              <w:t xml:space="preserve"> Simulator (prueba en PC, sin visor)</w:t>
             </w:r>
           </w:p>
         </w:tc>
@@ -289,10 +505,21 @@
             </w:tcMar>
           </w:tcPr>
           <w:p>
+            <w:pPr>
+              <w:spacing w:line="360" w:lineRule="auto"/>
+              <w:rPr>
+                <w:rFonts w:ascii="Arial" w:hAnsi="Arial" w:cs="Arial"/>
+                <w:sz w:val="24"/>
+                <w:szCs w:val="24"/>
+              </w:rPr>
+            </w:pPr>
             <w:r>
               <w:rPr>
+                <w:rFonts w:ascii="Arial" w:hAnsi="Arial" w:cs="Arial"/>
                 <w:b/>
                 <w:bCs/>
+                <w:sz w:val="24"/>
+                <w:szCs w:val="24"/>
               </w:rPr>
               <w:t>Tipo de luz</w:t>
             </w:r>
@@ -315,8 +542,49 @@
             </w:tcMar>
           </w:tcPr>
           <w:p>
+            <w:pPr>
+              <w:spacing w:line="360" w:lineRule="auto"/>
+              <w:rPr>
+                <w:rFonts w:ascii="Arial" w:hAnsi="Arial" w:cs="Arial"/>
+                <w:sz w:val="24"/>
+                <w:szCs w:val="24"/>
+              </w:rPr>
+            </w:pPr>
+            <w:proofErr w:type="spellStart"/>
             <w:r>
-              <w:t>Baked: 1 Directional (sol) + 3 Point Lights</w:t>
+              <w:rPr>
+                <w:rFonts w:ascii="Arial" w:hAnsi="Arial" w:cs="Arial"/>
+                <w:sz w:val="24"/>
+                <w:szCs w:val="24"/>
+              </w:rPr>
+              <w:t>Baked</w:t>
+            </w:r>
+            <w:proofErr w:type="spellEnd"/>
+            <w:r>
+              <w:rPr>
+                <w:rFonts w:ascii="Arial" w:hAnsi="Arial" w:cs="Arial"/>
+                <w:sz w:val="24"/>
+                <w:szCs w:val="24"/>
+              </w:rPr>
+              <w:t xml:space="preserve">: 1 </w:t>
+            </w:r>
+            <w:proofErr w:type="spellStart"/>
+            <w:r>
+              <w:rPr>
+                <w:rFonts w:ascii="Arial" w:hAnsi="Arial" w:cs="Arial"/>
+                <w:sz w:val="24"/>
+                <w:szCs w:val="24"/>
+              </w:rPr>
+              <w:t>Directional</w:t>
+            </w:r>
+            <w:proofErr w:type="spellEnd"/>
+            <w:r>
+              <w:rPr>
+                <w:rFonts w:ascii="Arial" w:hAnsi="Arial" w:cs="Arial"/>
+                <w:sz w:val="24"/>
+                <w:szCs w:val="24"/>
+              </w:rPr>
+              <w:t xml:space="preserve"> (sol) + 3 Point Lights</w:t>
             </w:r>
           </w:p>
         </w:tc>
@@ -340,13 +608,26 @@
             </w:tcMar>
           </w:tcPr>
           <w:p>
+            <w:pPr>
+              <w:spacing w:line="360" w:lineRule="auto"/>
+              <w:rPr>
+                <w:rFonts w:ascii="Arial" w:hAnsi="Arial" w:cs="Arial"/>
+                <w:sz w:val="24"/>
+                <w:szCs w:val="24"/>
+              </w:rPr>
+            </w:pPr>
+            <w:proofErr w:type="spellStart"/>
             <w:r>
               <w:rPr>
+                <w:rFonts w:ascii="Arial" w:hAnsi="Arial" w:cs="Arial"/>
                 <w:b/>
                 <w:bCs/>
+                <w:sz w:val="24"/>
+                <w:szCs w:val="24"/>
               </w:rPr>
               <w:t>Lightmapper</w:t>
             </w:r>
+            <w:proofErr w:type="spellEnd"/>
           </w:p>
         </w:tc>
         <w:tc>
@@ -366,8 +647,31 @@
             </w:tcMar>
           </w:tcPr>
           <w:p>
+            <w:pPr>
+              <w:spacing w:line="360" w:lineRule="auto"/>
+              <w:rPr>
+                <w:rFonts w:ascii="Arial" w:hAnsi="Arial" w:cs="Arial"/>
+                <w:sz w:val="24"/>
+                <w:szCs w:val="24"/>
+              </w:rPr>
+            </w:pPr>
+            <w:proofErr w:type="spellStart"/>
             <w:r>
-              <w:t>Progressive GPU (NVIDIA GeForce RTX 4050 Laptop GPU)</w:t>
+              <w:rPr>
+                <w:rFonts w:ascii="Arial" w:hAnsi="Arial" w:cs="Arial"/>
+                <w:sz w:val="24"/>
+                <w:szCs w:val="24"/>
+              </w:rPr>
+              <w:t>Progressive</w:t>
+            </w:r>
+            <w:proofErr w:type="spellEnd"/>
+            <w:r>
+              <w:rPr>
+                <w:rFonts w:ascii="Arial" w:hAnsi="Arial" w:cs="Arial"/>
+                <w:sz w:val="24"/>
+                <w:szCs w:val="24"/>
+              </w:rPr>
+              <w:t xml:space="preserve"> GPU (NVIDIA GeForce RTX 4050 Laptop GPU)</w:t>
             </w:r>
           </w:p>
         </w:tc>
@@ -391,13 +695,36 @@
             </w:tcMar>
           </w:tcPr>
           <w:p>
+            <w:pPr>
+              <w:spacing w:line="360" w:lineRule="auto"/>
+              <w:rPr>
+                <w:rFonts w:ascii="Arial" w:hAnsi="Arial" w:cs="Arial"/>
+                <w:sz w:val="24"/>
+                <w:szCs w:val="24"/>
+              </w:rPr>
+            </w:pPr>
             <w:r>
               <w:rPr>
+                <w:rFonts w:ascii="Arial" w:hAnsi="Arial" w:cs="Arial"/>
                 <w:b/>
                 <w:bCs/>
-              </w:rPr>
-              <w:t>Parámetros del bake</w:t>
+                <w:sz w:val="24"/>
+                <w:szCs w:val="24"/>
+              </w:rPr>
+              <w:t xml:space="preserve">Parámetros del </w:t>
             </w:r>
+            <w:proofErr w:type="spellStart"/>
+            <w:r>
+              <w:rPr>
+                <w:rFonts w:ascii="Arial" w:hAnsi="Arial" w:cs="Arial"/>
+                <w:b/>
+                <w:bCs/>
+                <w:sz w:val="24"/>
+                <w:szCs w:val="24"/>
+              </w:rPr>
+              <w:t>bake</w:t>
+            </w:r>
+            <w:proofErr w:type="spellEnd"/>
           </w:p>
         </w:tc>
         <w:tc>
@@ -417,8 +744,39 @@
             </w:tcMar>
           </w:tcPr>
           <w:p>
+            <w:pPr>
+              <w:spacing w:line="360" w:lineRule="auto"/>
+              <w:rPr>
+                <w:rFonts w:ascii="Arial" w:hAnsi="Arial" w:cs="Arial"/>
+                <w:sz w:val="24"/>
+                <w:szCs w:val="24"/>
+              </w:rPr>
+            </w:pPr>
             <w:r>
-              <w:t>Resolución 40 texels/unidad, tamaño máx. 1024, muestras directas 64 / indirectas 256 / entorno 128, 3 rebotes</w:t>
+              <w:rPr>
+                <w:rFonts w:ascii="Arial" w:hAnsi="Arial" w:cs="Arial"/>
+                <w:sz w:val="24"/>
+                <w:szCs w:val="24"/>
+              </w:rPr>
+              <w:t xml:space="preserve">Resolución 40 </w:t>
+            </w:r>
+            <w:proofErr w:type="spellStart"/>
+            <w:r>
+              <w:rPr>
+                <w:rFonts w:ascii="Arial" w:hAnsi="Arial" w:cs="Arial"/>
+                <w:sz w:val="24"/>
+                <w:szCs w:val="24"/>
+              </w:rPr>
+              <w:t>texels</w:t>
+            </w:r>
+            <w:proofErr w:type="spellEnd"/>
+            <w:r>
+              <w:rPr>
+                <w:rFonts w:ascii="Arial" w:hAnsi="Arial" w:cs="Arial"/>
+                <w:sz w:val="24"/>
+                <w:szCs w:val="24"/>
+              </w:rPr>
+              <w:t>/unidad, tamaño máx. 1024, muestras directas 64 / indirectas 256 / entorno 128, 3 rebotes</w:t>
             </w:r>
           </w:p>
         </w:tc>
@@ -442,12 +800,35 @@
             </w:tcMar>
           </w:tcPr>
           <w:p>
+            <w:pPr>
+              <w:spacing w:line="360" w:lineRule="auto"/>
+              <w:rPr>
+                <w:rFonts w:ascii="Arial" w:hAnsi="Arial" w:cs="Arial"/>
+                <w:sz w:val="24"/>
+                <w:szCs w:val="24"/>
+              </w:rPr>
+            </w:pPr>
+            <w:proofErr w:type="spellStart"/>
             <w:r>
               <w:rPr>
+                <w:rFonts w:ascii="Arial" w:hAnsi="Arial" w:cs="Arial"/>
                 <w:b/>
                 <w:bCs/>
-              </w:rPr>
-              <w:t>Lightmaps generados</w:t>
+                <w:sz w:val="24"/>
+                <w:szCs w:val="24"/>
+              </w:rPr>
+              <w:t>Lightmaps</w:t>
+            </w:r>
+            <w:proofErr w:type="spellEnd"/>
+            <w:r>
+              <w:rPr>
+                <w:rFonts w:ascii="Arial" w:hAnsi="Arial" w:cs="Arial"/>
+                <w:b/>
+                <w:bCs/>
+                <w:sz w:val="24"/>
+                <w:szCs w:val="24"/>
+              </w:rPr>
+              <w:t xml:space="preserve"> generados</w:t>
             </w:r>
           </w:p>
         </w:tc>
@@ -468,7 +849,20 @@
             </w:tcMar>
           </w:tcPr>
           <w:p>
+            <w:pPr>
+              <w:spacing w:line="360" w:lineRule="auto"/>
+              <w:rPr>
+                <w:rFonts w:ascii="Arial" w:hAnsi="Arial" w:cs="Arial"/>
+                <w:sz w:val="24"/>
+                <w:szCs w:val="24"/>
+              </w:rPr>
+            </w:pPr>
             <w:r>
+              <w:rPr>
+                <w:rFonts w:ascii="Arial" w:hAnsi="Arial" w:cs="Arial"/>
+                <w:sz w:val="24"/>
+                <w:szCs w:val="24"/>
+              </w:rPr>
               <w:t>5 (2 de 1024x1024 y 3 de 512x512), 7.3 MB en total</w:t>
             </w:r>
           </w:p>
@@ -493,13 +887,36 @@
             </w:tcMar>
           </w:tcPr>
           <w:p>
+            <w:pPr>
+              <w:spacing w:line="360" w:lineRule="auto"/>
+              <w:rPr>
+                <w:rFonts w:ascii="Arial" w:hAnsi="Arial" w:cs="Arial"/>
+                <w:sz w:val="24"/>
+                <w:szCs w:val="24"/>
+              </w:rPr>
+            </w:pPr>
             <w:r>
               <w:rPr>
+                <w:rFonts w:ascii="Arial" w:hAnsi="Arial" w:cs="Arial"/>
                 <w:b/>
                 <w:bCs/>
-              </w:rPr>
-              <w:t>Tiempo de bake</w:t>
+                <w:sz w:val="24"/>
+                <w:szCs w:val="24"/>
+              </w:rPr>
+              <w:t xml:space="preserve">Tiempo de </w:t>
             </w:r>
+            <w:proofErr w:type="spellStart"/>
+            <w:r>
+              <w:rPr>
+                <w:rFonts w:ascii="Arial" w:hAnsi="Arial" w:cs="Arial"/>
+                <w:b/>
+                <w:bCs/>
+                <w:sz w:val="24"/>
+                <w:szCs w:val="24"/>
+              </w:rPr>
+              <w:t>bake</w:t>
+            </w:r>
+            <w:proofErr w:type="spellEnd"/>
           </w:p>
         </w:tc>
         <w:tc>
@@ -519,8 +936,57 @@
             </w:tcMar>
           </w:tcPr>
           <w:p>
+            <w:pPr>
+              <w:spacing w:line="360" w:lineRule="auto"/>
+              <w:rPr>
+                <w:rFonts w:ascii="Arial" w:hAnsi="Arial" w:cs="Arial"/>
+                <w:sz w:val="24"/>
+                <w:szCs w:val="24"/>
+              </w:rPr>
+            </w:pPr>
             <w:r>
-              <w:t>00:00:33.09 (230.45 mrays/sec)</w:t>
+              <w:rPr>
+                <w:rFonts w:ascii="Arial" w:hAnsi="Arial" w:cs="Arial"/>
+                <w:sz w:val="24"/>
+                <w:szCs w:val="24"/>
+              </w:rPr>
+              <w:t xml:space="preserve">00:00:33.09 (230.45 </w:t>
+            </w:r>
+            <w:proofErr w:type="spellStart"/>
+            <w:r>
+              <w:rPr>
+                <w:rFonts w:ascii="Arial" w:hAnsi="Arial" w:cs="Arial"/>
+                <w:sz w:val="24"/>
+                <w:szCs w:val="24"/>
+              </w:rPr>
+              <w:t>mrays</w:t>
+            </w:r>
+            <w:proofErr w:type="spellEnd"/>
+            <w:r>
+              <w:rPr>
+                <w:rFonts w:ascii="Arial" w:hAnsi="Arial" w:cs="Arial"/>
+                <w:sz w:val="24"/>
+                <w:szCs w:val="24"/>
+              </w:rPr>
+              <w:t>/</w:t>
+            </w:r>
+            <w:proofErr w:type="spellStart"/>
+            <w:r>
+              <w:rPr>
+                <w:rFonts w:ascii="Arial" w:hAnsi="Arial" w:cs="Arial"/>
+                <w:sz w:val="24"/>
+                <w:szCs w:val="24"/>
+              </w:rPr>
+              <w:t>sec</w:t>
+            </w:r>
+            <w:proofErr w:type="spellEnd"/>
+            <w:r>
+              <w:rPr>
+                <w:rFonts w:ascii="Arial" w:hAnsi="Arial" w:cs="Arial"/>
+                <w:sz w:val="24"/>
+                <w:szCs w:val="24"/>
+              </w:rPr>
+              <w:t>)</w:t>
             </w:r>
           </w:p>
         </w:tc>
@@ -544,10 +1010,21 @@
             </w:tcMar>
           </w:tcPr>
           <w:p>
+            <w:pPr>
+              <w:spacing w:line="360" w:lineRule="auto"/>
+              <w:rPr>
+                <w:rFonts w:ascii="Arial" w:hAnsi="Arial" w:cs="Arial"/>
+                <w:sz w:val="24"/>
+                <w:szCs w:val="24"/>
+              </w:rPr>
+            </w:pPr>
             <w:r>
               <w:rPr>
+                <w:rFonts w:ascii="Arial" w:hAnsi="Arial" w:cs="Arial"/>
                 <w:b/>
                 <w:bCs/>
+                <w:sz w:val="24"/>
+                <w:szCs w:val="24"/>
               </w:rPr>
               <w:t>FPS en Play Mode (PC)</w:t>
             </w:r>
@@ -570,8 +1047,41 @@
             </w:tcMar>
           </w:tcPr>
           <w:p>
+            <w:pPr>
+              <w:spacing w:line="360" w:lineRule="auto"/>
+              <w:rPr>
+                <w:rFonts w:ascii="Arial" w:hAnsi="Arial" w:cs="Arial"/>
+                <w:sz w:val="24"/>
+                <w:szCs w:val="24"/>
+              </w:rPr>
+            </w:pPr>
             <w:r>
-              <w:t>Promedio 204.4 FPS; 218.4 FPS en Stats (4.6 ms por frame, GPU 1.6 ms)</w:t>
+              <w:rPr>
+                <w:rFonts w:ascii="Arial" w:hAnsi="Arial" w:cs="Arial"/>
+                <w:sz w:val="24"/>
+                <w:szCs w:val="24"/>
+              </w:rPr>
+              <w:t xml:space="preserve">Promedio 204.4 FPS; 218.4 FPS en Stats (4.6 ms por </w:t>
+            </w:r>
+            <w:proofErr w:type="spellStart"/>
+            <w:proofErr w:type="gramStart"/>
+            <w:r>
+              <w:rPr>
+                <w:rFonts w:ascii="Arial" w:hAnsi="Arial" w:cs="Arial"/>
+                <w:sz w:val="24"/>
+                <w:szCs w:val="24"/>
+              </w:rPr>
+              <w:t>frame</w:t>
+            </w:r>
+            <w:proofErr w:type="spellEnd"/>
+            <w:proofErr w:type="gramEnd"/>
+            <w:r>
+              <w:rPr>
+                <w:rFonts w:ascii="Arial" w:hAnsi="Arial" w:cs="Arial"/>
+                <w:sz w:val="24"/>
+                <w:szCs w:val="24"/>
+              </w:rPr>
+              <w:t>, GPU 1.6 ms)</w:t>
             </w:r>
           </w:p>
         </w:tc>
@@ -595,10 +1105,21 @@
             </w:tcMar>
           </w:tcPr>
           <w:p>
+            <w:pPr>
+              <w:spacing w:line="360" w:lineRule="auto"/>
+              <w:rPr>
+                <w:rFonts w:ascii="Arial" w:hAnsi="Arial" w:cs="Arial"/>
+                <w:sz w:val="24"/>
+                <w:szCs w:val="24"/>
+              </w:rPr>
+            </w:pPr>
             <w:r>
               <w:rPr>
+                <w:rFonts w:ascii="Arial" w:hAnsi="Arial" w:cs="Arial"/>
                 <w:b/>
                 <w:bCs/>
+                <w:sz w:val="24"/>
+                <w:szCs w:val="24"/>
               </w:rPr>
               <w:t>Audio 3D</w:t>
             </w:r>
@@ -621,8 +1142,49 @@
             </w:tcMar>
           </w:tcPr>
           <w:p>
+            <w:pPr>
+              <w:spacing w:line="360" w:lineRule="auto"/>
+              <w:rPr>
+                <w:rFonts w:ascii="Arial" w:hAnsi="Arial" w:cs="Arial"/>
+                <w:sz w:val="24"/>
+                <w:szCs w:val="24"/>
+              </w:rPr>
+            </w:pPr>
+            <w:proofErr w:type="spellStart"/>
             <w:r>
-              <w:t>Spatial Blend 1.0 + Logarithmic Rolloff (Min 1 m, Max 15 m)</w:t>
+              <w:rPr>
+                <w:rFonts w:ascii="Arial" w:hAnsi="Arial" w:cs="Arial"/>
+                <w:sz w:val="24"/>
+                <w:szCs w:val="24"/>
+              </w:rPr>
+              <w:t>Spatial</w:t>
+            </w:r>
+            <w:proofErr w:type="spellEnd"/>
+            <w:r>
+              <w:rPr>
+                <w:rFonts w:ascii="Arial" w:hAnsi="Arial" w:cs="Arial"/>
+                <w:sz w:val="24"/>
+                <w:szCs w:val="24"/>
+              </w:rPr>
+              <w:t xml:space="preserve"> Blend 1.0 + </w:t>
+            </w:r>
+            <w:proofErr w:type="spellStart"/>
+            <w:r>
+              <w:rPr>
+                <w:rFonts w:ascii="Arial" w:hAnsi="Arial" w:cs="Arial"/>
+                <w:sz w:val="24"/>
+                <w:szCs w:val="24"/>
+              </w:rPr>
+              <w:t>Logarithmic</w:t>
+            </w:r>
+            <w:proofErr w:type="spellEnd"/>
+            <w:r>
+              <w:rPr>
+                <w:rFonts w:ascii="Arial" w:hAnsi="Arial" w:cs="Arial"/>
+                <w:sz w:val="24"/>
+                <w:szCs w:val="24"/>
+              </w:rPr>
+              <w:t xml:space="preserve"> Rolloff (Min 1 m, Max 15 m)</w:t>
             </w:r>
           </w:p>
         </w:tc>
@@ -631,81 +1193,501 @@
     <w:p>
       <w:pPr>
         <w:pStyle w:val="Ttulo1"/>
-        <w:spacing w:before="280" w:after="120"/>
-      </w:pPr>
-      <w:r>
-        <w:rPr>
+        <w:spacing w:line="360" w:lineRule="auto"/>
+        <w:rPr>
+          <w:rFonts w:ascii="Arial" w:hAnsi="Arial" w:cs="Arial"/>
+          <w:sz w:val="24"/>
+          <w:szCs w:val="24"/>
+        </w:rPr>
+      </w:pPr>
+      <w:r>
+        <w:rPr>
+          <w:rFonts w:ascii="Arial" w:hAnsi="Arial" w:cs="Arial"/>
           <w:b/>
           <w:bCs/>
           <w:color w:val="1F3A4D"/>
-          <w:sz w:val="28"/>
-          <w:szCs w:val="28"/>
-        </w:rPr>
-        <w:t>2. Descripción de la escena</w:t>
-      </w:r>
-    </w:p>
-    <w:p>
-      <w:pPr>
-        <w:spacing w:after="120" w:line="300" w:lineRule="auto"/>
-      </w:pPr>
-      <w:r>
-        <w:t>Sala de estar de 10 x 8 m y 3.2 m de altura con una ventana en la pared norte. Incluye parquet con textura de tablones, zócalo y friso, alfombra, sofá, sillón, mesa de centro, aparador, estantería con libros, lámpara de pie, lámpara colgante, plantas, cuadros y un jardín visible desde la ventana.</w:t>
-      </w:r>
-    </w:p>
-    <w:p>
-      <w:pPr>
-        <w:spacing w:after="120" w:line="300" w:lineRule="auto"/>
-      </w:pPr>
-      <w:r>
-        <w:t>Toda la geometría arquitectónica y el mobiliario fijo están marcados como Static, para que participen en el bake. El sol entra por la ventana y proyecta una mancha de luz sobre el piso; las lámparas aportan luz cálida y sus pantallas emiten luz horneada (Baked Emissive).</w:t>
-      </w:r>
-    </w:p>
-    <w:p>
-      <w:pPr>
-        <w:spacing w:after="120" w:line="300" w:lineRule="auto"/>
-      </w:pPr>
-      <w:r>
-        <w:t>La radio (Audio_Object) no es estática, porque es el objeto que emite el sonido; recibe la iluminación mediante una malla de Light Probes.</w:t>
+          <w:sz w:val="24"/>
+          <w:szCs w:val="24"/>
+        </w:rPr>
+        <w:br/>
+      </w:r>
+      <w:r>
+        <w:rPr>
+          <w:rFonts w:ascii="Arial" w:hAnsi="Arial" w:cs="Arial"/>
+          <w:b/>
+          <w:bCs/>
+          <w:color w:val="1F3A4D"/>
+          <w:sz w:val="24"/>
+          <w:szCs w:val="24"/>
+        </w:rPr>
+        <w:t xml:space="preserve">2. </w:t>
+      </w:r>
+      <w:r>
+        <w:rPr>
+          <w:rFonts w:ascii="Arial" w:hAnsi="Arial" w:cs="Arial"/>
+          <w:b/>
+          <w:bCs/>
+          <w:color w:val="auto"/>
+          <w:sz w:val="24"/>
+          <w:szCs w:val="24"/>
+        </w:rPr>
+        <w:t>DESCRIPCION DE LA ESCENA</w:t>
+      </w:r>
+    </w:p>
+    <w:p>
+      <w:pPr>
+        <w:spacing w:line="360" w:lineRule="auto"/>
+        <w:rPr>
+          <w:rFonts w:ascii="Arial" w:hAnsi="Arial" w:cs="Arial"/>
+          <w:sz w:val="24"/>
+          <w:szCs w:val="24"/>
+        </w:rPr>
+      </w:pPr>
+      <w:r>
+        <w:rPr>
+          <w:rFonts w:ascii="Arial" w:hAnsi="Arial" w:cs="Arial"/>
+          <w:sz w:val="24"/>
+          <w:szCs w:val="24"/>
+        </w:rPr>
+        <w:t xml:space="preserve">Sala de estar de 10 x 8 m y 3.2 m de altura con una ventana en la pared norte. Incluye </w:t>
+      </w:r>
+      <w:proofErr w:type="spellStart"/>
+      <w:r>
+        <w:rPr>
+          <w:rFonts w:ascii="Arial" w:hAnsi="Arial" w:cs="Arial"/>
+          <w:sz w:val="24"/>
+          <w:szCs w:val="24"/>
+        </w:rPr>
+        <w:t>parquet</w:t>
+      </w:r>
+      <w:proofErr w:type="spellEnd"/>
+      <w:r>
+        <w:rPr>
+          <w:rFonts w:ascii="Arial" w:hAnsi="Arial" w:cs="Arial"/>
+          <w:sz w:val="24"/>
+          <w:szCs w:val="24"/>
+        </w:rPr>
+        <w:t xml:space="preserve"> con textura de tablones, zócalo y friso, alfombra, sofá, sillón, mesa de centro, aparador, estantería con libros, lámpara de pie, lámpara colgante, plantas, cuadros y un jardín visible desde la ventana.</w:t>
+      </w:r>
+    </w:p>
+    <w:p>
+      <w:pPr>
+        <w:spacing w:line="360" w:lineRule="auto"/>
+        <w:rPr>
+          <w:rFonts w:ascii="Arial" w:hAnsi="Arial" w:cs="Arial"/>
+          <w:sz w:val="24"/>
+          <w:szCs w:val="24"/>
+        </w:rPr>
+      </w:pPr>
+      <w:r>
+        <w:rPr>
+          <w:rFonts w:ascii="Arial" w:hAnsi="Arial" w:cs="Arial"/>
+          <w:sz w:val="24"/>
+          <w:szCs w:val="24"/>
+        </w:rPr>
+        <w:t xml:space="preserve">Toda la geometría arquitectónica y el mobiliario fijo están marcados como </w:t>
+      </w:r>
+      <w:proofErr w:type="spellStart"/>
+      <w:r>
+        <w:rPr>
+          <w:rFonts w:ascii="Arial" w:hAnsi="Arial" w:cs="Arial"/>
+          <w:sz w:val="24"/>
+          <w:szCs w:val="24"/>
+        </w:rPr>
+        <w:t>Static</w:t>
+      </w:r>
+      <w:proofErr w:type="spellEnd"/>
+      <w:r>
+        <w:rPr>
+          <w:rFonts w:ascii="Arial" w:hAnsi="Arial" w:cs="Arial"/>
+          <w:sz w:val="24"/>
+          <w:szCs w:val="24"/>
+        </w:rPr>
+        <w:t xml:space="preserve">, para que participen en el </w:t>
+      </w:r>
+      <w:proofErr w:type="spellStart"/>
+      <w:r>
+        <w:rPr>
+          <w:rFonts w:ascii="Arial" w:hAnsi="Arial" w:cs="Arial"/>
+          <w:sz w:val="24"/>
+          <w:szCs w:val="24"/>
+        </w:rPr>
+        <w:t>bake</w:t>
+      </w:r>
+      <w:proofErr w:type="spellEnd"/>
+      <w:r>
+        <w:rPr>
+          <w:rFonts w:ascii="Arial" w:hAnsi="Arial" w:cs="Arial"/>
+          <w:sz w:val="24"/>
+          <w:szCs w:val="24"/>
+        </w:rPr>
+        <w:t xml:space="preserve">. El sol entra por la ventana y proyecta una mancha </w:t>
+      </w:r>
+      <w:r>
+        <w:rPr>
+          <w:rFonts w:ascii="Arial" w:hAnsi="Arial" w:cs="Arial"/>
+          <w:sz w:val="24"/>
+          <w:szCs w:val="24"/>
+        </w:rPr>
+        <w:lastRenderedPageBreak/>
+        <w:t>de luz sobre el piso; las lámparas aportan luz cálida y sus pantallas emiten luz horneada (</w:t>
+      </w:r>
+      <w:proofErr w:type="spellStart"/>
+      <w:r>
+        <w:rPr>
+          <w:rFonts w:ascii="Arial" w:hAnsi="Arial" w:cs="Arial"/>
+          <w:sz w:val="24"/>
+          <w:szCs w:val="24"/>
+        </w:rPr>
+        <w:t>Baked</w:t>
+      </w:r>
+      <w:proofErr w:type="spellEnd"/>
+      <w:r>
+        <w:rPr>
+          <w:rFonts w:ascii="Arial" w:hAnsi="Arial" w:cs="Arial"/>
+          <w:sz w:val="24"/>
+          <w:szCs w:val="24"/>
+        </w:rPr>
+        <w:t xml:space="preserve"> </w:t>
+      </w:r>
+      <w:proofErr w:type="spellStart"/>
+      <w:r>
+        <w:rPr>
+          <w:rFonts w:ascii="Arial" w:hAnsi="Arial" w:cs="Arial"/>
+          <w:sz w:val="24"/>
+          <w:szCs w:val="24"/>
+        </w:rPr>
+        <w:t>Emissive</w:t>
+      </w:r>
+      <w:proofErr w:type="spellEnd"/>
+      <w:r>
+        <w:rPr>
+          <w:rFonts w:ascii="Arial" w:hAnsi="Arial" w:cs="Arial"/>
+          <w:sz w:val="24"/>
+          <w:szCs w:val="24"/>
+        </w:rPr>
+        <w:t>).</w:t>
+      </w:r>
+    </w:p>
+    <w:p>
+      <w:pPr>
+        <w:spacing w:line="360" w:lineRule="auto"/>
+        <w:rPr>
+          <w:rFonts w:ascii="Arial" w:hAnsi="Arial" w:cs="Arial"/>
+          <w:sz w:val="24"/>
+          <w:szCs w:val="24"/>
+        </w:rPr>
+      </w:pPr>
+      <w:r>
+        <w:rPr>
+          <w:rFonts w:ascii="Arial" w:hAnsi="Arial" w:cs="Arial"/>
+          <w:sz w:val="24"/>
+          <w:szCs w:val="24"/>
+        </w:rPr>
+        <w:t>La radio (</w:t>
+      </w:r>
+      <w:proofErr w:type="spellStart"/>
+      <w:r>
+        <w:rPr>
+          <w:rFonts w:ascii="Arial" w:hAnsi="Arial" w:cs="Arial"/>
+          <w:sz w:val="24"/>
+          <w:szCs w:val="24"/>
+        </w:rPr>
+        <w:t>Audio_Object</w:t>
+      </w:r>
+      <w:proofErr w:type="spellEnd"/>
+      <w:r>
+        <w:rPr>
+          <w:rFonts w:ascii="Arial" w:hAnsi="Arial" w:cs="Arial"/>
+          <w:sz w:val="24"/>
+          <w:szCs w:val="24"/>
+        </w:rPr>
+        <w:t>) no es estática, porque es el objeto que emite el sonido; recibe la iluminación mediante una malla de Light Probes.</w:t>
       </w:r>
     </w:p>
     <w:p>
       <w:pPr>
         <w:pStyle w:val="Ttulo1"/>
-        <w:spacing w:before="280" w:after="120"/>
-      </w:pPr>
-      <w:r>
-        <w:rPr>
-          <w:b/>
-          <w:bCs/>
-          <w:color w:val="1F3A4D"/>
-          <w:sz w:val="28"/>
-          <w:szCs w:val="28"/>
-        </w:rPr>
-        <w:t>3. Iluminación pre-calculada (Lightmaps)</w:t>
-      </w:r>
-    </w:p>
-    <w:p>
-      <w:pPr>
-        <w:spacing w:after="120" w:line="300" w:lineRule="auto"/>
-      </w:pPr>
-      <w:r>
-        <w:t>El bake terminó correctamente con 5 lightmaps en 33.09 s usando Progressive GPU. Con luces Baked y geometría estática, la iluminación se almacena en texturas y no se recalcula en cada cuadro, lo que reduce el costo de GPU; esto es clave en visores autónomos.</w:t>
-      </w:r>
-    </w:p>
-    <w:p>
-      <w:pPr>
-        <w:spacing w:before="120" w:after="60"/>
+        <w:spacing w:line="360" w:lineRule="auto"/>
+        <w:rPr>
+          <w:rFonts w:ascii="Arial" w:hAnsi="Arial" w:cs="Arial"/>
+          <w:color w:val="auto"/>
+          <w:sz w:val="24"/>
+          <w:szCs w:val="24"/>
+        </w:rPr>
+      </w:pPr>
+      <w:r>
+        <w:rPr>
+          <w:rFonts w:ascii="Arial" w:hAnsi="Arial" w:cs="Arial"/>
+          <w:b/>
+          <w:bCs/>
+          <w:color w:val="auto"/>
+          <w:sz w:val="24"/>
+          <w:szCs w:val="24"/>
+        </w:rPr>
+        <w:t xml:space="preserve">3. </w:t>
+      </w:r>
+      <w:r>
+        <w:rPr>
+          <w:rFonts w:ascii="Arial" w:hAnsi="Arial" w:cs="Arial"/>
+          <w:b/>
+          <w:bCs/>
+          <w:color w:val="auto"/>
+          <w:sz w:val="24"/>
+          <w:szCs w:val="24"/>
+        </w:rPr>
+        <w:t>ILUMINACIÓN PRE-CALCULADA (LIGHTMAPS)</w:t>
+      </w:r>
+    </w:p>
+    <w:p>
+      <w:pPr>
+        <w:spacing w:line="360" w:lineRule="auto"/>
+        <w:rPr>
+          <w:rFonts w:ascii="Arial" w:hAnsi="Arial" w:cs="Arial"/>
+          <w:sz w:val="24"/>
+          <w:szCs w:val="24"/>
+        </w:rPr>
+      </w:pPr>
+      <w:r>
+        <w:rPr>
+          <w:rFonts w:ascii="Arial" w:hAnsi="Arial" w:cs="Arial"/>
+          <w:sz w:val="24"/>
+          <w:szCs w:val="24"/>
+        </w:rPr>
+        <w:t xml:space="preserve">El </w:t>
+      </w:r>
+      <w:proofErr w:type="spellStart"/>
+      <w:r>
+        <w:rPr>
+          <w:rFonts w:ascii="Arial" w:hAnsi="Arial" w:cs="Arial"/>
+          <w:sz w:val="24"/>
+          <w:szCs w:val="24"/>
+        </w:rPr>
+        <w:t>bake</w:t>
+      </w:r>
+      <w:proofErr w:type="spellEnd"/>
+      <w:r>
+        <w:rPr>
+          <w:rFonts w:ascii="Arial" w:hAnsi="Arial" w:cs="Arial"/>
+          <w:sz w:val="24"/>
+          <w:szCs w:val="24"/>
+        </w:rPr>
+        <w:t xml:space="preserve"> terminó correctamente con 5 </w:t>
+      </w:r>
+      <w:proofErr w:type="spellStart"/>
+      <w:r>
+        <w:rPr>
+          <w:rFonts w:ascii="Arial" w:hAnsi="Arial" w:cs="Arial"/>
+          <w:sz w:val="24"/>
+          <w:szCs w:val="24"/>
+        </w:rPr>
+        <w:t>lightmaps</w:t>
+      </w:r>
+      <w:proofErr w:type="spellEnd"/>
+      <w:r>
+        <w:rPr>
+          <w:rFonts w:ascii="Arial" w:hAnsi="Arial" w:cs="Arial"/>
+          <w:sz w:val="24"/>
+          <w:szCs w:val="24"/>
+        </w:rPr>
+        <w:t xml:space="preserve"> en 33.09 s usando </w:t>
+      </w:r>
+      <w:proofErr w:type="spellStart"/>
+      <w:r>
+        <w:rPr>
+          <w:rFonts w:ascii="Arial" w:hAnsi="Arial" w:cs="Arial"/>
+          <w:sz w:val="24"/>
+          <w:szCs w:val="24"/>
+        </w:rPr>
+        <w:t>Progressive</w:t>
+      </w:r>
+      <w:proofErr w:type="spellEnd"/>
+      <w:r>
+        <w:rPr>
+          <w:rFonts w:ascii="Arial" w:hAnsi="Arial" w:cs="Arial"/>
+          <w:sz w:val="24"/>
+          <w:szCs w:val="24"/>
+        </w:rPr>
+        <w:t xml:space="preserve"> GPU. Con luces </w:t>
+      </w:r>
+      <w:proofErr w:type="spellStart"/>
+      <w:r>
+        <w:rPr>
+          <w:rFonts w:ascii="Arial" w:hAnsi="Arial" w:cs="Arial"/>
+          <w:sz w:val="24"/>
+          <w:szCs w:val="24"/>
+        </w:rPr>
+        <w:t>Baked</w:t>
+      </w:r>
+      <w:proofErr w:type="spellEnd"/>
+      <w:r>
+        <w:rPr>
+          <w:rFonts w:ascii="Arial" w:hAnsi="Arial" w:cs="Arial"/>
+          <w:sz w:val="24"/>
+          <w:szCs w:val="24"/>
+        </w:rPr>
+        <w:t xml:space="preserve"> y geometría estática, la iluminación se almacena en texturas y no se recalcula en cada cuadro, lo que reduce el costo de GPU; esto es clave en visores autónomos.</w:t>
+      </w:r>
+    </w:p>
+    <w:p>
+      <w:pPr>
+        <w:spacing w:line="360" w:lineRule="auto"/>
+        <w:rPr>
+          <w:rFonts w:ascii="Arial" w:hAnsi="Arial" w:cs="Arial"/>
+          <w:b/>
+          <w:bCs/>
+          <w:i/>
+          <w:iCs/>
+          <w:sz w:val="24"/>
+          <w:szCs w:val="24"/>
+        </w:rPr>
+      </w:pPr>
+      <w:r>
+        <w:rPr>
+          <w:rFonts w:ascii="Arial" w:hAnsi="Arial" w:cs="Arial"/>
+          <w:b/>
+          <w:bCs/>
+          <w:i/>
+          <w:iCs/>
+          <w:sz w:val="24"/>
+          <w:szCs w:val="24"/>
+        </w:rPr>
+        <w:t xml:space="preserve">Figura 1. Ventana </w:t>
+      </w:r>
+      <w:proofErr w:type="spellStart"/>
+      <w:r>
+        <w:rPr>
+          <w:rFonts w:ascii="Arial" w:hAnsi="Arial" w:cs="Arial"/>
+          <w:b/>
+          <w:bCs/>
+          <w:i/>
+          <w:iCs/>
+          <w:sz w:val="24"/>
+          <w:szCs w:val="24"/>
+        </w:rPr>
+        <w:t>Lighting</w:t>
+      </w:r>
+      <w:proofErr w:type="spellEnd"/>
+      <w:r>
+        <w:rPr>
+          <w:rFonts w:ascii="Arial" w:hAnsi="Arial" w:cs="Arial"/>
+          <w:b/>
+          <w:bCs/>
+          <w:i/>
+          <w:iCs/>
+          <w:sz w:val="24"/>
+          <w:szCs w:val="24"/>
+        </w:rPr>
+        <w:t xml:space="preserve">: parámetros del </w:t>
+      </w:r>
+      <w:proofErr w:type="spellStart"/>
+      <w:r>
+        <w:rPr>
+          <w:rFonts w:ascii="Arial" w:hAnsi="Arial" w:cs="Arial"/>
+          <w:b/>
+          <w:bCs/>
+          <w:i/>
+          <w:iCs/>
+          <w:sz w:val="24"/>
+          <w:szCs w:val="24"/>
+        </w:rPr>
+        <w:t>bake</w:t>
+      </w:r>
+      <w:proofErr w:type="spellEnd"/>
+      <w:r>
+        <w:rPr>
+          <w:rFonts w:ascii="Arial" w:hAnsi="Arial" w:cs="Arial"/>
+          <w:b/>
+          <w:bCs/>
+          <w:i/>
+          <w:iCs/>
+          <w:sz w:val="24"/>
+          <w:szCs w:val="24"/>
+        </w:rPr>
+        <w:t xml:space="preserve">, 5 </w:t>
+      </w:r>
+      <w:proofErr w:type="spellStart"/>
+      <w:r>
+        <w:rPr>
+          <w:rFonts w:ascii="Arial" w:hAnsi="Arial" w:cs="Arial"/>
+          <w:b/>
+          <w:bCs/>
+          <w:i/>
+          <w:iCs/>
+          <w:sz w:val="24"/>
+          <w:szCs w:val="24"/>
+        </w:rPr>
+        <w:t>lightmaps</w:t>
+      </w:r>
+      <w:proofErr w:type="spellEnd"/>
+      <w:r>
+        <w:rPr>
+          <w:rFonts w:ascii="Arial" w:hAnsi="Arial" w:cs="Arial"/>
+          <w:b/>
+          <w:bCs/>
+          <w:i/>
+          <w:iCs/>
+          <w:sz w:val="24"/>
+          <w:szCs w:val="24"/>
+        </w:rPr>
+        <w:t xml:space="preserve"> generados y tiempo de </w:t>
+      </w:r>
+      <w:proofErr w:type="spellStart"/>
+      <w:r>
+        <w:rPr>
+          <w:rFonts w:ascii="Arial" w:hAnsi="Arial" w:cs="Arial"/>
+          <w:b/>
+          <w:bCs/>
+          <w:i/>
+          <w:iCs/>
+          <w:sz w:val="24"/>
+          <w:szCs w:val="24"/>
+        </w:rPr>
+        <w:t>bake</w:t>
+      </w:r>
+      <w:proofErr w:type="spellEnd"/>
+      <w:r>
+        <w:rPr>
+          <w:rFonts w:ascii="Arial" w:hAnsi="Arial" w:cs="Arial"/>
+          <w:b/>
+          <w:bCs/>
+          <w:i/>
+          <w:iCs/>
+          <w:sz w:val="24"/>
+          <w:szCs w:val="24"/>
+        </w:rPr>
+        <w:t>.</w:t>
+      </w:r>
+    </w:p>
+    <w:p>
+      <w:pPr>
+        <w:spacing w:line="360" w:lineRule="auto"/>
         <w:jc w:val="center"/>
-      </w:pPr>
-      <w:r>
-        <w:rPr>
+        <w:rPr>
+          <w:rFonts w:ascii="Arial" w:hAnsi="Arial" w:cs="Arial"/>
+          <w:sz w:val="24"/>
+          <w:szCs w:val="24"/>
+        </w:rPr>
+      </w:pPr>
+      <w:r>
+        <w:rPr>
+          <w:rFonts w:ascii="Arial" w:hAnsi="Arial" w:cs="Arial"/>
           <w:noProof/>
-        </w:rPr>
-        <w:lastRenderedPageBreak/>
+          <w:sz w:val="24"/>
+          <w:szCs w:val="24"/>
+        </w:rPr>
         <w:drawing>
-          <wp:inline distT="0" distB="0" distL="0" distR="0" wp14:anchorId="004C053C" wp14:editId="004C053D">
-            <wp:extent cx="4676775" cy="4257675"/>
+          <wp:anchor distT="0" distB="0" distL="114300" distR="114300" simplePos="0" relativeHeight="251658240" behindDoc="0" locked="0" layoutInCell="1" allowOverlap="1" wp14:anchorId="004C053C" wp14:editId="14C894A5">
+            <wp:simplePos x="0" y="0"/>
+            <wp:positionH relativeFrom="margin">
+              <wp:posOffset>523875</wp:posOffset>
+            </wp:positionH>
+            <wp:positionV relativeFrom="paragraph">
+              <wp:posOffset>53341</wp:posOffset>
+            </wp:positionV>
+            <wp:extent cx="4314825" cy="3928160"/>
             <wp:effectExtent l="0" t="0" r="0" b="0"/>
+            <wp:wrapNone/>
             <wp:docPr id="1" name="Captura_Lighting.png" descr="Captura_Lighting.png" title="Captura_Lighting.png"/>
             <wp:cNvGraphicFramePr>
               <a:graphicFrameLocks xmlns:a="http://schemas.openxmlformats.org/drawingml/2006/main" noChangeAspect="1"/>
@@ -720,7 +1702,13 @@
                     </pic:cNvPicPr>
                   </pic:nvPicPr>
                   <pic:blipFill>
-                    <a:blip r:embed="rId5"/>
+                    <a:blip r:embed="rId5" cstate="print">
+                      <a:extLst>
+                        <a:ext uri="{28A0092B-C50C-407E-A947-70E740481C1C}">
+                          <a14:useLocalDpi xmlns:a14="http://schemas.microsoft.com/office/drawing/2010/main" val="0"/>
+                        </a:ext>
+                      </a:extLst>
+                    </a:blip>
                     <a:srcRect/>
                     <a:stretch>
                       <a:fillRect/>
@@ -729,7 +1717,7 @@
                   <pic:spPr bwMode="auto">
                     <a:xfrm>
                       <a:off x="0" y="0"/>
-                      <a:ext cx="4676775" cy="4257675"/>
+                      <a:ext cx="4317313" cy="3930425"/>
                     </a:xfrm>
                     <a:prstGeom prst="rect">
                       <a:avLst/>
@@ -738,40 +1726,389 @@
                 </pic:pic>
               </a:graphicData>
             </a:graphic>
-          </wp:inline>
+            <wp14:sizeRelH relativeFrom="margin">
+              <wp14:pctWidth>0</wp14:pctWidth>
+            </wp14:sizeRelH>
+            <wp14:sizeRelV relativeFrom="margin">
+              <wp14:pctHeight>0</wp14:pctHeight>
+            </wp14:sizeRelV>
+          </wp:anchor>
         </w:drawing>
       </w:r>
     </w:p>
     <w:p>
       <w:pPr>
-        <w:spacing w:after="200"/>
+        <w:spacing w:line="360" w:lineRule="auto"/>
         <w:jc w:val="center"/>
-      </w:pPr>
-      <w:r>
-        <w:rPr>
+        <w:rPr>
+          <w:rFonts w:ascii="Arial" w:hAnsi="Arial" w:cs="Arial"/>
+          <w:sz w:val="24"/>
+          <w:szCs w:val="24"/>
+        </w:rPr>
+      </w:pPr>
+    </w:p>
+    <w:p>
+      <w:pPr>
+        <w:spacing w:line="360" w:lineRule="auto"/>
+        <w:jc w:val="center"/>
+        <w:rPr>
+          <w:rFonts w:ascii="Arial" w:hAnsi="Arial" w:cs="Arial"/>
+          <w:sz w:val="24"/>
+          <w:szCs w:val="24"/>
+        </w:rPr>
+      </w:pPr>
+    </w:p>
+    <w:p>
+      <w:pPr>
+        <w:spacing w:line="360" w:lineRule="auto"/>
+        <w:jc w:val="center"/>
+        <w:rPr>
+          <w:rFonts w:ascii="Arial" w:hAnsi="Arial" w:cs="Arial"/>
+          <w:sz w:val="24"/>
+          <w:szCs w:val="24"/>
+        </w:rPr>
+      </w:pPr>
+    </w:p>
+    <w:p>
+      <w:pPr>
+        <w:spacing w:line="360" w:lineRule="auto"/>
+        <w:jc w:val="center"/>
+        <w:rPr>
+          <w:rFonts w:ascii="Arial" w:hAnsi="Arial" w:cs="Arial"/>
+          <w:sz w:val="24"/>
+          <w:szCs w:val="24"/>
+        </w:rPr>
+      </w:pPr>
+    </w:p>
+    <w:p>
+      <w:pPr>
+        <w:spacing w:line="360" w:lineRule="auto"/>
+        <w:jc w:val="center"/>
+        <w:rPr>
+          <w:rFonts w:ascii="Arial" w:hAnsi="Arial" w:cs="Arial"/>
+          <w:sz w:val="24"/>
+          <w:szCs w:val="24"/>
+        </w:rPr>
+      </w:pPr>
+    </w:p>
+    <w:p>
+      <w:pPr>
+        <w:spacing w:line="360" w:lineRule="auto"/>
+        <w:jc w:val="center"/>
+        <w:rPr>
+          <w:rFonts w:ascii="Arial" w:hAnsi="Arial" w:cs="Arial"/>
+          <w:sz w:val="24"/>
+          <w:szCs w:val="24"/>
+        </w:rPr>
+      </w:pPr>
+    </w:p>
+    <w:p>
+      <w:pPr>
+        <w:spacing w:line="360" w:lineRule="auto"/>
+        <w:jc w:val="center"/>
+        <w:rPr>
+          <w:rFonts w:ascii="Arial" w:hAnsi="Arial" w:cs="Arial"/>
+          <w:sz w:val="24"/>
+          <w:szCs w:val="24"/>
+        </w:rPr>
+      </w:pPr>
+    </w:p>
+    <w:p>
+      <w:pPr>
+        <w:spacing w:line="360" w:lineRule="auto"/>
+        <w:jc w:val="center"/>
+        <w:rPr>
+          <w:rFonts w:ascii="Arial" w:hAnsi="Arial" w:cs="Arial"/>
+          <w:sz w:val="24"/>
+          <w:szCs w:val="24"/>
+        </w:rPr>
+      </w:pPr>
+    </w:p>
+    <w:p>
+      <w:pPr>
+        <w:spacing w:line="360" w:lineRule="auto"/>
+        <w:jc w:val="center"/>
+        <w:rPr>
+          <w:rFonts w:ascii="Arial" w:hAnsi="Arial" w:cs="Arial"/>
+          <w:sz w:val="24"/>
+          <w:szCs w:val="24"/>
+        </w:rPr>
+      </w:pPr>
+    </w:p>
+    <w:p>
+      <w:pPr>
+        <w:spacing w:line="360" w:lineRule="auto"/>
+        <w:jc w:val="center"/>
+        <w:rPr>
+          <w:rFonts w:ascii="Arial" w:hAnsi="Arial" w:cs="Arial"/>
+          <w:sz w:val="24"/>
+          <w:szCs w:val="24"/>
+        </w:rPr>
+      </w:pPr>
+    </w:p>
+    <w:p>
+      <w:pPr>
+        <w:spacing w:line="360" w:lineRule="auto"/>
+        <w:jc w:val="center"/>
+        <w:rPr>
+          <w:rFonts w:ascii="Arial" w:hAnsi="Arial" w:cs="Arial"/>
+          <w:sz w:val="24"/>
+          <w:szCs w:val="24"/>
+        </w:rPr>
+      </w:pPr>
+    </w:p>
+    <w:p>
+      <w:pPr>
+        <w:spacing w:line="360" w:lineRule="auto"/>
+        <w:jc w:val="center"/>
+        <w:rPr>
+          <w:rFonts w:ascii="Arial" w:hAnsi="Arial" w:cs="Arial"/>
+          <w:sz w:val="24"/>
+          <w:szCs w:val="24"/>
+        </w:rPr>
+      </w:pPr>
+    </w:p>
+    <w:p>
+      <w:pPr>
+        <w:spacing w:line="360" w:lineRule="auto"/>
+        <w:jc w:val="center"/>
+        <w:rPr>
+          <w:rFonts w:ascii="Arial" w:hAnsi="Arial" w:cs="Arial"/>
+          <w:sz w:val="24"/>
+          <w:szCs w:val="24"/>
+        </w:rPr>
+      </w:pPr>
+    </w:p>
+    <w:p>
+      <w:pPr>
+        <w:spacing w:line="360" w:lineRule="auto"/>
+        <w:jc w:val="center"/>
+        <w:rPr>
+          <w:rFonts w:ascii="Arial" w:hAnsi="Arial" w:cs="Arial"/>
+          <w:sz w:val="24"/>
+          <w:szCs w:val="24"/>
+        </w:rPr>
+      </w:pPr>
+    </w:p>
+    <w:p>
+      <w:pPr>
+        <w:spacing w:line="360" w:lineRule="auto"/>
+        <w:jc w:val="center"/>
+        <w:rPr>
+          <w:rFonts w:ascii="Arial" w:hAnsi="Arial" w:cs="Arial"/>
+          <w:sz w:val="24"/>
+          <w:szCs w:val="24"/>
+        </w:rPr>
+      </w:pPr>
+      <w:r>
+        <w:rPr>
+          <w:rFonts w:ascii="Arial" w:hAnsi="Arial" w:cs="Arial"/>
+          <w:sz w:val="24"/>
+          <w:szCs w:val="24"/>
+        </w:rPr>
+        <w:br/>
+      </w:r>
+    </w:p>
+    <w:p>
+      <w:pPr>
+        <w:spacing w:line="360" w:lineRule="auto"/>
+        <w:jc w:val="center"/>
+        <w:rPr>
+          <w:rFonts w:ascii="Arial" w:hAnsi="Arial" w:cs="Arial"/>
+          <w:sz w:val="24"/>
+          <w:szCs w:val="24"/>
+        </w:rPr>
+      </w:pPr>
+    </w:p>
+    <w:p>
+      <w:pPr>
+        <w:spacing w:line="360" w:lineRule="auto"/>
+        <w:jc w:val="center"/>
+        <w:rPr>
+          <w:rFonts w:ascii="Arial" w:hAnsi="Arial" w:cs="Arial"/>
+          <w:sz w:val="24"/>
+          <w:szCs w:val="24"/>
+        </w:rPr>
+      </w:pPr>
+    </w:p>
+    <w:p>
+      <w:pPr>
+        <w:spacing w:line="360" w:lineRule="auto"/>
+        <w:jc w:val="center"/>
+        <w:rPr>
+          <w:rFonts w:ascii="Arial" w:hAnsi="Arial" w:cs="Arial"/>
+          <w:sz w:val="24"/>
+          <w:szCs w:val="24"/>
+        </w:rPr>
+      </w:pPr>
+    </w:p>
+    <w:p>
+      <w:pPr>
+        <w:spacing w:line="360" w:lineRule="auto"/>
+        <w:jc w:val="center"/>
+        <w:rPr>
+          <w:rFonts w:ascii="Arial" w:hAnsi="Arial" w:cs="Arial"/>
+          <w:sz w:val="24"/>
+          <w:szCs w:val="24"/>
+        </w:rPr>
+      </w:pPr>
+    </w:p>
+    <w:p>
+      <w:pPr>
+        <w:spacing w:line="360" w:lineRule="auto"/>
+        <w:jc w:val="center"/>
+        <w:rPr>
+          <w:rFonts w:ascii="Arial" w:hAnsi="Arial" w:cs="Arial"/>
+          <w:sz w:val="24"/>
+          <w:szCs w:val="24"/>
+        </w:rPr>
+      </w:pPr>
+    </w:p>
+    <w:p>
+      <w:pPr>
+        <w:spacing w:line="360" w:lineRule="auto"/>
+        <w:jc w:val="center"/>
+        <w:rPr>
+          <w:rFonts w:ascii="Arial" w:hAnsi="Arial" w:cs="Arial"/>
+          <w:sz w:val="24"/>
+          <w:szCs w:val="24"/>
+        </w:rPr>
+      </w:pPr>
+    </w:p>
+    <w:p>
+      <w:pPr>
+        <w:spacing w:line="360" w:lineRule="auto"/>
+        <w:rPr>
+          <w:rFonts w:ascii="Arial" w:hAnsi="Arial" w:cs="Arial"/>
+          <w:b/>
+          <w:bCs/>
           <w:i/>
           <w:iCs/>
-          <w:color w:val="555555"/>
-          <w:sz w:val="18"/>
-          <w:szCs w:val="18"/>
-        </w:rPr>
-        <w:t>Figura 1. Ventana Lighting: parámetros del bake, 5 lightmaps generados y tiempo de bake.</w:t>
-      </w:r>
-    </w:p>
-    <w:p>
-      <w:pPr>
-        <w:spacing w:before="120" w:after="60"/>
+          <w:sz w:val="24"/>
+          <w:szCs w:val="24"/>
+        </w:rPr>
+      </w:pPr>
+      <w:r>
+        <w:rPr>
+          <w:rFonts w:ascii="Arial" w:hAnsi="Arial" w:cs="Arial"/>
+          <w:b/>
+          <w:bCs/>
+          <w:i/>
+          <w:iCs/>
+          <w:sz w:val="24"/>
+          <w:szCs w:val="24"/>
+        </w:rPr>
+        <w:lastRenderedPageBreak/>
+        <w:t xml:space="preserve">Figura 2. Pestaña </w:t>
+      </w:r>
+      <w:proofErr w:type="spellStart"/>
+      <w:r>
+        <w:rPr>
+          <w:rFonts w:ascii="Arial" w:hAnsi="Arial" w:cs="Arial"/>
+          <w:b/>
+          <w:bCs/>
+          <w:i/>
+          <w:iCs/>
+          <w:sz w:val="24"/>
+          <w:szCs w:val="24"/>
+        </w:rPr>
+        <w:t>Baked</w:t>
+      </w:r>
+      <w:proofErr w:type="spellEnd"/>
+      <w:r>
+        <w:rPr>
+          <w:rFonts w:ascii="Arial" w:hAnsi="Arial" w:cs="Arial"/>
+          <w:b/>
+          <w:bCs/>
+          <w:i/>
+          <w:iCs/>
+          <w:sz w:val="24"/>
+          <w:szCs w:val="24"/>
+        </w:rPr>
+        <w:t xml:space="preserve"> </w:t>
+      </w:r>
+      <w:proofErr w:type="spellStart"/>
+      <w:r>
+        <w:rPr>
+          <w:rFonts w:ascii="Arial" w:hAnsi="Arial" w:cs="Arial"/>
+          <w:b/>
+          <w:bCs/>
+          <w:i/>
+          <w:iCs/>
+          <w:sz w:val="24"/>
+          <w:szCs w:val="24"/>
+        </w:rPr>
+        <w:t>Lightmaps</w:t>
+      </w:r>
+      <w:proofErr w:type="spellEnd"/>
+      <w:r>
+        <w:rPr>
+          <w:rFonts w:ascii="Arial" w:hAnsi="Arial" w:cs="Arial"/>
+          <w:b/>
+          <w:bCs/>
+          <w:i/>
+          <w:iCs/>
+          <w:sz w:val="24"/>
+          <w:szCs w:val="24"/>
+        </w:rPr>
+        <w:t xml:space="preserve"> con los 5 </w:t>
+      </w:r>
+      <w:proofErr w:type="spellStart"/>
+      <w:r>
+        <w:rPr>
+          <w:rFonts w:ascii="Arial" w:hAnsi="Arial" w:cs="Arial"/>
+          <w:b/>
+          <w:bCs/>
+          <w:i/>
+          <w:iCs/>
+          <w:sz w:val="24"/>
+          <w:szCs w:val="24"/>
+        </w:rPr>
+        <w:t>lightmaps</w:t>
+      </w:r>
+      <w:proofErr w:type="spellEnd"/>
+      <w:r>
+        <w:rPr>
+          <w:rFonts w:ascii="Arial" w:hAnsi="Arial" w:cs="Arial"/>
+          <w:b/>
+          <w:bCs/>
+          <w:i/>
+          <w:iCs/>
+          <w:sz w:val="24"/>
+          <w:szCs w:val="24"/>
+        </w:rPr>
+        <w:t xml:space="preserve"> de la escena.</w:t>
+      </w:r>
+    </w:p>
+    <w:p>
+      <w:pPr>
+        <w:spacing w:line="360" w:lineRule="auto"/>
         <w:jc w:val="center"/>
-      </w:pPr>
-      <w:r>
-        <w:rPr>
+        <w:rPr>
+          <w:rFonts w:ascii="Arial" w:hAnsi="Arial" w:cs="Arial"/>
+          <w:sz w:val="24"/>
+          <w:szCs w:val="24"/>
+        </w:rPr>
+      </w:pPr>
+      <w:r>
+        <w:rPr>
+          <w:rFonts w:ascii="Arial" w:hAnsi="Arial" w:cs="Arial"/>
           <w:noProof/>
-        </w:rPr>
-        <w:lastRenderedPageBreak/>
+          <w:sz w:val="24"/>
+          <w:szCs w:val="24"/>
+        </w:rPr>
         <w:drawing>
-          <wp:inline distT="0" distB="0" distL="0" distR="0" wp14:anchorId="004C053E" wp14:editId="004C053F">
+          <wp:anchor distT="0" distB="0" distL="114300" distR="114300" simplePos="0" relativeHeight="251659264" behindDoc="0" locked="0" layoutInCell="1" allowOverlap="1" wp14:anchorId="004C053E" wp14:editId="5EC7099C">
+            <wp:simplePos x="0" y="0"/>
+            <wp:positionH relativeFrom="margin">
+              <wp:align>center</wp:align>
+            </wp:positionH>
+            <wp:positionV relativeFrom="paragraph">
+              <wp:posOffset>69850</wp:posOffset>
+            </wp:positionV>
             <wp:extent cx="2876550" cy="4495800"/>
             <wp:effectExtent l="0" t="0" r="0" b="0"/>
+            <wp:wrapNone/>
             <wp:docPr id="2" name="Captura_Lightmaps.png" descr="Captura_Lightmaps.png" title="Captura_Lightmaps.png"/>
             <wp:cNvGraphicFramePr>
               <a:graphicFrameLocks xmlns:a="http://schemas.openxmlformats.org/drawingml/2006/main" noChangeAspect="1"/>
@@ -786,7 +2123,13 @@
                     </pic:cNvPicPr>
                   </pic:nvPicPr>
                   <pic:blipFill>
-                    <a:blip r:embed="rId6"/>
+                    <a:blip r:embed="rId6" cstate="print">
+                      <a:extLst>
+                        <a:ext uri="{28A0092B-C50C-407E-A947-70E740481C1C}">
+                          <a14:useLocalDpi xmlns:a14="http://schemas.microsoft.com/office/drawing/2010/main" val="0"/>
+                        </a:ext>
+                      </a:extLst>
+                    </a:blip>
                     <a:srcRect/>
                     <a:stretch>
                       <a:fillRect/>
@@ -804,63 +2147,359 @@
                 </pic:pic>
               </a:graphicData>
             </a:graphic>
-          </wp:inline>
+          </wp:anchor>
         </w:drawing>
       </w:r>
     </w:p>
     <w:p>
       <w:pPr>
-        <w:spacing w:after="200"/>
+        <w:spacing w:line="360" w:lineRule="auto"/>
         <w:jc w:val="center"/>
-      </w:pPr>
-      <w:r>
-        <w:rPr>
+        <w:rPr>
+          <w:rFonts w:ascii="Arial" w:hAnsi="Arial" w:cs="Arial"/>
+          <w:sz w:val="24"/>
+          <w:szCs w:val="24"/>
+        </w:rPr>
+      </w:pPr>
+    </w:p>
+    <w:p>
+      <w:pPr>
+        <w:spacing w:line="360" w:lineRule="auto"/>
+        <w:jc w:val="center"/>
+        <w:rPr>
+          <w:rFonts w:ascii="Arial" w:hAnsi="Arial" w:cs="Arial"/>
+          <w:sz w:val="24"/>
+          <w:szCs w:val="24"/>
+        </w:rPr>
+      </w:pPr>
+    </w:p>
+    <w:p>
+      <w:pPr>
+        <w:spacing w:line="360" w:lineRule="auto"/>
+        <w:jc w:val="center"/>
+        <w:rPr>
+          <w:rFonts w:ascii="Arial" w:hAnsi="Arial" w:cs="Arial"/>
+          <w:sz w:val="24"/>
+          <w:szCs w:val="24"/>
+        </w:rPr>
+      </w:pPr>
+    </w:p>
+    <w:p>
+      <w:pPr>
+        <w:spacing w:line="360" w:lineRule="auto"/>
+        <w:jc w:val="center"/>
+        <w:rPr>
+          <w:rFonts w:ascii="Arial" w:hAnsi="Arial" w:cs="Arial"/>
+          <w:sz w:val="24"/>
+          <w:szCs w:val="24"/>
+        </w:rPr>
+      </w:pPr>
+    </w:p>
+    <w:p>
+      <w:pPr>
+        <w:spacing w:line="360" w:lineRule="auto"/>
+        <w:jc w:val="center"/>
+        <w:rPr>
+          <w:rFonts w:ascii="Arial" w:hAnsi="Arial" w:cs="Arial"/>
+          <w:sz w:val="24"/>
+          <w:szCs w:val="24"/>
+        </w:rPr>
+      </w:pPr>
+    </w:p>
+    <w:p>
+      <w:pPr>
+        <w:spacing w:line="360" w:lineRule="auto"/>
+        <w:jc w:val="center"/>
+        <w:rPr>
+          <w:rFonts w:ascii="Arial" w:hAnsi="Arial" w:cs="Arial"/>
+          <w:sz w:val="24"/>
+          <w:szCs w:val="24"/>
+        </w:rPr>
+      </w:pPr>
+    </w:p>
+    <w:p>
+      <w:pPr>
+        <w:spacing w:line="360" w:lineRule="auto"/>
+        <w:jc w:val="center"/>
+        <w:rPr>
+          <w:rFonts w:ascii="Arial" w:hAnsi="Arial" w:cs="Arial"/>
+          <w:sz w:val="24"/>
+          <w:szCs w:val="24"/>
+        </w:rPr>
+      </w:pPr>
+    </w:p>
+    <w:p>
+      <w:pPr>
+        <w:spacing w:line="360" w:lineRule="auto"/>
+        <w:jc w:val="center"/>
+        <w:rPr>
+          <w:rFonts w:ascii="Arial" w:hAnsi="Arial" w:cs="Arial"/>
+          <w:sz w:val="24"/>
+          <w:szCs w:val="24"/>
+        </w:rPr>
+      </w:pPr>
+    </w:p>
+    <w:p>
+      <w:pPr>
+        <w:spacing w:line="360" w:lineRule="auto"/>
+        <w:jc w:val="center"/>
+        <w:rPr>
+          <w:rFonts w:ascii="Arial" w:hAnsi="Arial" w:cs="Arial"/>
+          <w:sz w:val="24"/>
+          <w:szCs w:val="24"/>
+        </w:rPr>
+      </w:pPr>
+    </w:p>
+    <w:p>
+      <w:pPr>
+        <w:spacing w:line="360" w:lineRule="auto"/>
+        <w:jc w:val="center"/>
+        <w:rPr>
+          <w:rFonts w:ascii="Arial" w:hAnsi="Arial" w:cs="Arial"/>
+          <w:sz w:val="24"/>
+          <w:szCs w:val="24"/>
+        </w:rPr>
+      </w:pPr>
+    </w:p>
+    <w:p>
+      <w:pPr>
+        <w:spacing w:line="360" w:lineRule="auto"/>
+        <w:jc w:val="center"/>
+        <w:rPr>
+          <w:rFonts w:ascii="Arial" w:hAnsi="Arial" w:cs="Arial"/>
+          <w:sz w:val="24"/>
+          <w:szCs w:val="24"/>
+        </w:rPr>
+      </w:pPr>
+    </w:p>
+    <w:p>
+      <w:pPr>
+        <w:spacing w:line="360" w:lineRule="auto"/>
+        <w:jc w:val="center"/>
+        <w:rPr>
+          <w:rFonts w:ascii="Arial" w:hAnsi="Arial" w:cs="Arial"/>
+          <w:sz w:val="24"/>
+          <w:szCs w:val="24"/>
+        </w:rPr>
+      </w:pPr>
+    </w:p>
+    <w:p>
+      <w:pPr>
+        <w:spacing w:line="360" w:lineRule="auto"/>
+        <w:jc w:val="center"/>
+        <w:rPr>
+          <w:rFonts w:ascii="Arial" w:hAnsi="Arial" w:cs="Arial"/>
+          <w:sz w:val="24"/>
+          <w:szCs w:val="24"/>
+        </w:rPr>
+      </w:pPr>
+    </w:p>
+    <w:p>
+      <w:pPr>
+        <w:spacing w:line="360" w:lineRule="auto"/>
+        <w:jc w:val="center"/>
+        <w:rPr>
+          <w:rFonts w:ascii="Arial" w:hAnsi="Arial" w:cs="Arial"/>
+          <w:sz w:val="24"/>
+          <w:szCs w:val="24"/>
+        </w:rPr>
+      </w:pPr>
+    </w:p>
+    <w:p>
+      <w:pPr>
+        <w:spacing w:line="360" w:lineRule="auto"/>
+        <w:jc w:val="center"/>
+        <w:rPr>
+          <w:rFonts w:ascii="Arial" w:hAnsi="Arial" w:cs="Arial"/>
+          <w:sz w:val="24"/>
+          <w:szCs w:val="24"/>
+        </w:rPr>
+      </w:pPr>
+    </w:p>
+    <w:p>
+      <w:pPr>
+        <w:spacing w:line="360" w:lineRule="auto"/>
+        <w:jc w:val="center"/>
+        <w:rPr>
+          <w:rFonts w:ascii="Arial" w:hAnsi="Arial" w:cs="Arial"/>
+          <w:sz w:val="24"/>
+          <w:szCs w:val="24"/>
+        </w:rPr>
+      </w:pPr>
+    </w:p>
+    <w:p>
+      <w:pPr>
+        <w:spacing w:line="360" w:lineRule="auto"/>
+        <w:jc w:val="center"/>
+        <w:rPr>
+          <w:rFonts w:ascii="Arial" w:hAnsi="Arial" w:cs="Arial"/>
+          <w:sz w:val="24"/>
+          <w:szCs w:val="24"/>
+        </w:rPr>
+      </w:pPr>
+    </w:p>
+    <w:p>
+      <w:pPr>
+        <w:pStyle w:val="Ttulo1"/>
+        <w:spacing w:line="360" w:lineRule="auto"/>
+        <w:rPr>
+          <w:rFonts w:ascii="Arial" w:hAnsi="Arial" w:cs="Arial"/>
+          <w:color w:val="auto"/>
+          <w:sz w:val="24"/>
+          <w:szCs w:val="24"/>
+        </w:rPr>
+      </w:pPr>
+      <w:r>
+        <w:rPr>
+          <w:rFonts w:ascii="Arial" w:hAnsi="Arial" w:cs="Arial"/>
+          <w:b/>
+          <w:bCs/>
+          <w:color w:val="auto"/>
+          <w:sz w:val="24"/>
+          <w:szCs w:val="24"/>
+        </w:rPr>
+        <w:t xml:space="preserve">4. </w:t>
+      </w:r>
+      <w:r>
+        <w:rPr>
+          <w:rFonts w:ascii="Arial" w:hAnsi="Arial" w:cs="Arial"/>
+          <w:b/>
+          <w:bCs/>
+          <w:color w:val="auto"/>
+          <w:sz w:val="24"/>
+          <w:szCs w:val="24"/>
+        </w:rPr>
+        <w:t>RENDIMIENTO (FPS)</w:t>
+      </w:r>
+    </w:p>
+    <w:p>
+      <w:pPr>
+        <w:spacing w:line="360" w:lineRule="auto"/>
+        <w:rPr>
+          <w:rFonts w:ascii="Arial" w:hAnsi="Arial" w:cs="Arial"/>
+          <w:sz w:val="24"/>
+          <w:szCs w:val="24"/>
+        </w:rPr>
+      </w:pPr>
+      <w:r>
+        <w:rPr>
+          <w:rFonts w:ascii="Arial" w:hAnsi="Arial" w:cs="Arial"/>
+          <w:sz w:val="24"/>
+          <w:szCs w:val="24"/>
+        </w:rPr>
+        <w:t>Se midió el rendimiento en Play Mode recorriendo la sala. El contador de FPS de la escena marcó 246 FPS en el instante de la captura y un promedio de 204.4 FPS.</w:t>
+      </w:r>
+    </w:p>
+    <w:p>
+      <w:pPr>
+        <w:spacing w:line="360" w:lineRule="auto"/>
+        <w:rPr>
+          <w:rFonts w:ascii="Arial" w:hAnsi="Arial" w:cs="Arial"/>
+          <w:b/>
+          <w:bCs/>
           <w:i/>
           <w:iCs/>
-          <w:color w:val="555555"/>
-          <w:sz w:val="18"/>
-          <w:szCs w:val="18"/>
-        </w:rPr>
-        <w:t>Figura 2. Pestaña Baked Lightmaps con los 5 lightmaps de la escena.</w:t>
-      </w:r>
-    </w:p>
-    <w:p>
-      <w:pPr>
-        <w:pStyle w:val="Ttulo1"/>
-        <w:spacing w:before="280" w:after="120"/>
-      </w:pPr>
-      <w:r>
-        <w:rPr>
-          <w:b/>
-          <w:bCs/>
-          <w:color w:val="1F3A4D"/>
-          <w:sz w:val="28"/>
-          <w:szCs w:val="28"/>
-        </w:rPr>
-        <w:t>4. Rendimiento (FPS)</w:t>
-      </w:r>
-    </w:p>
-    <w:p>
-      <w:pPr>
-        <w:spacing w:after="120" w:line="300" w:lineRule="auto"/>
-      </w:pPr>
-      <w:r>
-        <w:t>Se midió el rendimiento en Play Mode recorriendo la sala. El contador de FPS de la escena marcó 246 FPS en el instante de la captura y un promedio de 204.4 FPS.</w:t>
-      </w:r>
-    </w:p>
-    <w:p>
-      <w:pPr>
-        <w:spacing w:before="120" w:after="60"/>
-        <w:jc w:val="center"/>
-      </w:pPr>
-      <w:r>
-        <w:rPr>
+          <w:sz w:val="24"/>
+          <w:szCs w:val="24"/>
+        </w:rPr>
+      </w:pPr>
+      <w:r>
+        <w:rPr>
+          <w:rFonts w:ascii="Arial" w:hAnsi="Arial" w:cs="Arial"/>
+          <w:b/>
+          <w:bCs/>
+          <w:i/>
+          <w:iCs/>
+          <w:sz w:val="24"/>
+          <w:szCs w:val="24"/>
+        </w:rPr>
+        <w:t xml:space="preserve">Figura 3. Contador de FPS en el </w:t>
+      </w:r>
+      <w:proofErr w:type="spellStart"/>
+      <w:r>
+        <w:rPr>
+          <w:rFonts w:ascii="Arial" w:hAnsi="Arial" w:cs="Arial"/>
+          <w:b/>
+          <w:bCs/>
+          <w:i/>
+          <w:iCs/>
+          <w:sz w:val="24"/>
+          <w:szCs w:val="24"/>
+        </w:rPr>
+        <w:t>Game</w:t>
+      </w:r>
+      <w:proofErr w:type="spellEnd"/>
+      <w:r>
+        <w:rPr>
+          <w:rFonts w:ascii="Arial" w:hAnsi="Arial" w:cs="Arial"/>
+          <w:b/>
+          <w:bCs/>
+          <w:i/>
+          <w:iCs/>
+          <w:sz w:val="24"/>
+          <w:szCs w:val="24"/>
+        </w:rPr>
+        <w:t xml:space="preserve"> </w:t>
+      </w:r>
+      <w:proofErr w:type="spellStart"/>
+      <w:r>
+        <w:rPr>
+          <w:rFonts w:ascii="Arial" w:hAnsi="Arial" w:cs="Arial"/>
+          <w:b/>
+          <w:bCs/>
+          <w:i/>
+          <w:iCs/>
+          <w:sz w:val="24"/>
+          <w:szCs w:val="24"/>
+        </w:rPr>
+        <w:t>view</w:t>
+      </w:r>
+      <w:proofErr w:type="spellEnd"/>
+      <w:r>
+        <w:rPr>
+          <w:rFonts w:ascii="Arial" w:hAnsi="Arial" w:cs="Arial"/>
+          <w:b/>
+          <w:bCs/>
+          <w:i/>
+          <w:iCs/>
+          <w:sz w:val="24"/>
+          <w:szCs w:val="24"/>
+        </w:rPr>
+        <w:t xml:space="preserve"> (actual y promedio).</w:t>
+      </w:r>
+    </w:p>
+    <w:p>
+      <w:pPr>
+        <w:spacing w:line="360" w:lineRule="auto"/>
+        <w:rPr>
+          <w:rFonts w:ascii="Arial" w:hAnsi="Arial" w:cs="Arial"/>
+          <w:b/>
+          <w:bCs/>
+          <w:i/>
+          <w:iCs/>
+          <w:sz w:val="24"/>
+          <w:szCs w:val="24"/>
+        </w:rPr>
+      </w:pPr>
+      <w:r>
+        <w:rPr>
+          <w:rFonts w:ascii="Arial" w:hAnsi="Arial" w:cs="Arial"/>
           <w:noProof/>
+          <w:sz w:val="24"/>
+          <w:szCs w:val="24"/>
         </w:rPr>
         <w:drawing>
-          <wp:inline distT="0" distB="0" distL="0" distR="0" wp14:anchorId="004C0540" wp14:editId="004C0541">
+          <wp:anchor distT="0" distB="0" distL="114300" distR="114300" simplePos="0" relativeHeight="251661312" behindDoc="0" locked="0" layoutInCell="1" allowOverlap="1" wp14:anchorId="004C0540" wp14:editId="01CD1E82">
+            <wp:simplePos x="0" y="0"/>
+            <wp:positionH relativeFrom="margin">
+              <wp:align>center</wp:align>
+            </wp:positionH>
+            <wp:positionV relativeFrom="paragraph">
+              <wp:posOffset>104775</wp:posOffset>
+            </wp:positionV>
             <wp:extent cx="3238500" cy="809625"/>
-            <wp:effectExtent l="0" t="0" r="0" b="0"/>
+            <wp:effectExtent l="0" t="0" r="0" b="9525"/>
+            <wp:wrapNone/>
             <wp:docPr id="3" name="Captura_FPS.png" descr="Captura_FPS.png" title="Captura_FPS.png"/>
             <wp:cNvGraphicFramePr>
               <a:graphicFrameLocks xmlns:a="http://schemas.openxmlformats.org/drawingml/2006/main" noChangeAspect="1"/>
@@ -875,7 +2514,13 @@
                     </pic:cNvPicPr>
                   </pic:nvPicPr>
                   <pic:blipFill>
-                    <a:blip r:embed="rId7"/>
+                    <a:blip r:embed="rId7">
+                      <a:extLst>
+                        <a:ext uri="{28A0092B-C50C-407E-A947-70E740481C1C}">
+                          <a14:useLocalDpi xmlns:a14="http://schemas.microsoft.com/office/drawing/2010/main" val="0"/>
+                        </a:ext>
+                      </a:extLst>
+                    </a:blip>
                     <a:srcRect/>
                     <a:stretch>
                       <a:fillRect/>
@@ -893,46 +2538,255 @@
                 </pic:pic>
               </a:graphicData>
             </a:graphic>
-          </wp:inline>
+          </wp:anchor>
         </w:drawing>
       </w:r>
     </w:p>
     <w:p>
       <w:pPr>
-        <w:spacing w:after="200"/>
-        <w:jc w:val="center"/>
-      </w:pPr>
-      <w:r>
-        <w:rPr>
+        <w:spacing w:line="360" w:lineRule="auto"/>
+        <w:rPr>
+          <w:rFonts w:ascii="Arial" w:hAnsi="Arial" w:cs="Arial"/>
+          <w:b/>
+          <w:bCs/>
           <w:i/>
           <w:iCs/>
-          <w:color w:val="555555"/>
-          <w:sz w:val="18"/>
-          <w:szCs w:val="18"/>
-        </w:rPr>
-        <w:t>Figura 3. Contador de FPS en el Game view (actual y promedio).</w:t>
-      </w:r>
-    </w:p>
-    <w:p>
-      <w:pPr>
-        <w:spacing w:after="120" w:line="300" w:lineRule="auto"/>
-      </w:pPr>
-      <w:r>
-        <w:t>La ventana Statistics confirma el rendimiento: 218.4 FPS, 4.6 ms por frame, 1.6 ms de GPU, 25.0 mil triángulos, 22.7 mil vértices y 141 draw calls.</w:t>
-      </w:r>
-    </w:p>
-    <w:p>
-      <w:pPr>
-        <w:spacing w:before="120" w:after="60"/>
+          <w:sz w:val="24"/>
+          <w:szCs w:val="24"/>
+        </w:rPr>
+      </w:pPr>
+    </w:p>
+    <w:p>
+      <w:pPr>
+        <w:spacing w:line="360" w:lineRule="auto"/>
         <w:jc w:val="center"/>
-      </w:pPr>
-      <w:r>
-        <w:rPr>
+        <w:rPr>
+          <w:rFonts w:ascii="Arial" w:hAnsi="Arial" w:cs="Arial"/>
+          <w:sz w:val="24"/>
+          <w:szCs w:val="24"/>
+        </w:rPr>
+      </w:pPr>
+      <w:r>
+        <w:rPr>
+          <w:rFonts w:ascii="Arial" w:hAnsi="Arial" w:cs="Arial"/>
+          <w:sz w:val="24"/>
+          <w:szCs w:val="24"/>
+        </w:rPr>
+        <w:br/>
+      </w:r>
+    </w:p>
+    <w:p>
+      <w:pPr>
+        <w:spacing w:line="360" w:lineRule="auto"/>
+        <w:rPr>
+          <w:rFonts w:ascii="Arial" w:hAnsi="Arial" w:cs="Arial"/>
+          <w:sz w:val="24"/>
+          <w:szCs w:val="24"/>
+        </w:rPr>
+      </w:pPr>
+      <w:r>
+        <w:rPr>
+          <w:rFonts w:ascii="Arial" w:hAnsi="Arial" w:cs="Arial"/>
+          <w:sz w:val="24"/>
+          <w:szCs w:val="24"/>
+        </w:rPr>
+        <w:t xml:space="preserve">La ventana </w:t>
+      </w:r>
+      <w:proofErr w:type="spellStart"/>
+      <w:r>
+        <w:rPr>
+          <w:rFonts w:ascii="Arial" w:hAnsi="Arial" w:cs="Arial"/>
+          <w:sz w:val="24"/>
+          <w:szCs w:val="24"/>
+        </w:rPr>
+        <w:t>Statistics</w:t>
+      </w:r>
+      <w:proofErr w:type="spellEnd"/>
+      <w:r>
+        <w:rPr>
+          <w:rFonts w:ascii="Arial" w:hAnsi="Arial" w:cs="Arial"/>
+          <w:sz w:val="24"/>
+          <w:szCs w:val="24"/>
+        </w:rPr>
+        <w:t xml:space="preserve"> confirma el rendimiento: 218.4 FPS, 4.6 ms por </w:t>
+      </w:r>
+      <w:proofErr w:type="spellStart"/>
+      <w:proofErr w:type="gramStart"/>
+      <w:r>
+        <w:rPr>
+          <w:rFonts w:ascii="Arial" w:hAnsi="Arial" w:cs="Arial"/>
+          <w:sz w:val="24"/>
+          <w:szCs w:val="24"/>
+        </w:rPr>
+        <w:t>frame</w:t>
+      </w:r>
+      <w:proofErr w:type="spellEnd"/>
+      <w:proofErr w:type="gramEnd"/>
+      <w:r>
+        <w:rPr>
+          <w:rFonts w:ascii="Arial" w:hAnsi="Arial" w:cs="Arial"/>
+          <w:sz w:val="24"/>
+          <w:szCs w:val="24"/>
+        </w:rPr>
+        <w:t xml:space="preserve">, 1.6 ms de GPU, 25.0 mil triángulos, 22.7 mil vértices y 141 </w:t>
+      </w:r>
+      <w:proofErr w:type="spellStart"/>
+      <w:r>
+        <w:rPr>
+          <w:rFonts w:ascii="Arial" w:hAnsi="Arial" w:cs="Arial"/>
+          <w:sz w:val="24"/>
+          <w:szCs w:val="24"/>
+        </w:rPr>
+        <w:t>draw</w:t>
+      </w:r>
+      <w:proofErr w:type="spellEnd"/>
+      <w:r>
+        <w:rPr>
+          <w:rFonts w:ascii="Arial" w:hAnsi="Arial" w:cs="Arial"/>
+          <w:sz w:val="24"/>
+          <w:szCs w:val="24"/>
+        </w:rPr>
+        <w:t xml:space="preserve"> </w:t>
+      </w:r>
+      <w:proofErr w:type="spellStart"/>
+      <w:r>
+        <w:rPr>
+          <w:rFonts w:ascii="Arial" w:hAnsi="Arial" w:cs="Arial"/>
+          <w:sz w:val="24"/>
+          <w:szCs w:val="24"/>
+        </w:rPr>
+        <w:t>calls</w:t>
+      </w:r>
+      <w:proofErr w:type="spellEnd"/>
+      <w:r>
+        <w:rPr>
+          <w:rFonts w:ascii="Arial" w:hAnsi="Arial" w:cs="Arial"/>
+          <w:sz w:val="24"/>
+          <w:szCs w:val="24"/>
+        </w:rPr>
+        <w:t>.</w:t>
+      </w:r>
+      <w:r>
+        <w:rPr>
+          <w:rFonts w:ascii="Arial" w:hAnsi="Arial" w:cs="Arial"/>
+          <w:sz w:val="24"/>
+          <w:szCs w:val="24"/>
+        </w:rPr>
+        <w:br/>
+      </w:r>
+    </w:p>
+    <w:p>
+      <w:pPr>
+        <w:spacing w:line="360" w:lineRule="auto"/>
+        <w:rPr>
+          <w:rFonts w:ascii="Arial" w:hAnsi="Arial" w:cs="Arial"/>
+          <w:sz w:val="24"/>
+          <w:szCs w:val="24"/>
+        </w:rPr>
+      </w:pPr>
+    </w:p>
+    <w:p>
+      <w:pPr>
+        <w:spacing w:line="360" w:lineRule="auto"/>
+        <w:rPr>
+          <w:rFonts w:ascii="Arial" w:hAnsi="Arial" w:cs="Arial"/>
+          <w:sz w:val="24"/>
+          <w:szCs w:val="24"/>
+        </w:rPr>
+      </w:pPr>
+    </w:p>
+    <w:p>
+      <w:pPr>
+        <w:spacing w:line="360" w:lineRule="auto"/>
+        <w:rPr>
+          <w:rFonts w:ascii="Arial" w:hAnsi="Arial" w:cs="Arial"/>
+          <w:sz w:val="24"/>
+          <w:szCs w:val="24"/>
+        </w:rPr>
+      </w:pPr>
+    </w:p>
+    <w:p>
+      <w:pPr>
+        <w:spacing w:line="360" w:lineRule="auto"/>
+        <w:rPr>
+          <w:rFonts w:ascii="Arial" w:hAnsi="Arial" w:cs="Arial"/>
+          <w:sz w:val="24"/>
+          <w:szCs w:val="24"/>
+        </w:rPr>
+      </w:pPr>
+    </w:p>
+    <w:p>
+      <w:pPr>
+        <w:spacing w:line="360" w:lineRule="auto"/>
+        <w:rPr>
+          <w:rFonts w:ascii="Arial" w:hAnsi="Arial" w:cs="Arial"/>
+          <w:b/>
+          <w:bCs/>
+          <w:i/>
+          <w:iCs/>
+          <w:sz w:val="24"/>
+          <w:szCs w:val="24"/>
+        </w:rPr>
+      </w:pPr>
+      <w:r>
+        <w:rPr>
+          <w:rFonts w:ascii="Arial" w:hAnsi="Arial" w:cs="Arial"/>
+          <w:b/>
+          <w:bCs/>
+          <w:i/>
+          <w:iCs/>
+          <w:sz w:val="24"/>
+          <w:szCs w:val="24"/>
+        </w:rPr>
+        <w:lastRenderedPageBreak/>
+        <w:t xml:space="preserve">Figura 4. Ventana </w:t>
+      </w:r>
+      <w:proofErr w:type="spellStart"/>
+      <w:r>
+        <w:rPr>
+          <w:rFonts w:ascii="Arial" w:hAnsi="Arial" w:cs="Arial"/>
+          <w:b/>
+          <w:bCs/>
+          <w:i/>
+          <w:iCs/>
+          <w:sz w:val="24"/>
+          <w:szCs w:val="24"/>
+        </w:rPr>
+        <w:t>Statistics</w:t>
+      </w:r>
+      <w:proofErr w:type="spellEnd"/>
+      <w:r>
+        <w:rPr>
+          <w:rFonts w:ascii="Arial" w:hAnsi="Arial" w:cs="Arial"/>
+          <w:b/>
+          <w:bCs/>
+          <w:i/>
+          <w:iCs/>
+          <w:sz w:val="24"/>
+          <w:szCs w:val="24"/>
+        </w:rPr>
+        <w:t xml:space="preserve"> en Play Mode.</w:t>
+      </w:r>
+    </w:p>
+    <w:p>
+      <w:pPr>
+        <w:spacing w:line="360" w:lineRule="auto"/>
+        <w:jc w:val="center"/>
+        <w:rPr>
+          <w:rFonts w:ascii="Arial" w:hAnsi="Arial" w:cs="Arial"/>
+          <w:sz w:val="24"/>
+          <w:szCs w:val="24"/>
+        </w:rPr>
+      </w:pPr>
+      <w:r>
+        <w:rPr>
+          <w:rFonts w:ascii="Arial" w:hAnsi="Arial" w:cs="Arial"/>
           <w:noProof/>
-        </w:rPr>
-        <w:lastRenderedPageBreak/>
+          <w:sz w:val="24"/>
+          <w:szCs w:val="24"/>
+        </w:rPr>
         <w:drawing>
-          <wp:inline distT="0" distB="0" distL="0" distR="0" wp14:anchorId="004C0542" wp14:editId="004C0543">
+          <wp:inline distT="0" distB="0" distL="0" distR="0" wp14:anchorId="004C0542" wp14:editId="63BEE24E">
             <wp:extent cx="3600450" cy="2914650"/>
             <wp:effectExtent l="0" t="0" r="0" b="0"/>
             <wp:docPr id="4" name="Captura_Stats.png" descr="Captura_Stats.png" title="Captura_Stats.png"/>
@@ -973,41 +2827,158 @@
     </w:p>
     <w:p>
       <w:pPr>
-        <w:spacing w:after="200"/>
-        <w:jc w:val="center"/>
-      </w:pPr>
-      <w:r>
-        <w:rPr>
+        <w:spacing w:line="360" w:lineRule="auto"/>
+        <w:rPr>
+          <w:rFonts w:ascii="Arial" w:hAnsi="Arial" w:cs="Arial"/>
+          <w:sz w:val="24"/>
+          <w:szCs w:val="24"/>
+        </w:rPr>
+      </w:pPr>
+      <w:r>
+        <w:rPr>
+          <w:rFonts w:ascii="Arial" w:hAnsi="Arial" w:cs="Arial"/>
+          <w:sz w:val="24"/>
+          <w:szCs w:val="24"/>
+        </w:rPr>
+        <w:br/>
+      </w:r>
+      <w:r>
+        <w:rPr>
+          <w:rFonts w:ascii="Arial" w:hAnsi="Arial" w:cs="Arial"/>
+          <w:sz w:val="24"/>
+          <w:szCs w:val="24"/>
+        </w:rPr>
+        <w:t xml:space="preserve">En el </w:t>
+      </w:r>
+      <w:proofErr w:type="spellStart"/>
+      <w:r>
+        <w:rPr>
+          <w:rFonts w:ascii="Arial" w:hAnsi="Arial" w:cs="Arial"/>
+          <w:sz w:val="24"/>
+          <w:szCs w:val="24"/>
+        </w:rPr>
+        <w:t>Profiler</w:t>
+      </w:r>
+      <w:proofErr w:type="spellEnd"/>
+      <w:r>
+        <w:rPr>
+          <w:rFonts w:ascii="Arial" w:hAnsi="Arial" w:cs="Arial"/>
+          <w:sz w:val="24"/>
+          <w:szCs w:val="24"/>
+        </w:rPr>
+        <w:t xml:space="preserve">, el tiempo de CPU por </w:t>
+      </w:r>
+      <w:proofErr w:type="spellStart"/>
+      <w:proofErr w:type="gramStart"/>
+      <w:r>
+        <w:rPr>
+          <w:rFonts w:ascii="Arial" w:hAnsi="Arial" w:cs="Arial"/>
+          <w:sz w:val="24"/>
+          <w:szCs w:val="24"/>
+        </w:rPr>
+        <w:t>frame</w:t>
+      </w:r>
+      <w:proofErr w:type="spellEnd"/>
+      <w:proofErr w:type="gramEnd"/>
+      <w:r>
+        <w:rPr>
+          <w:rFonts w:ascii="Arial" w:hAnsi="Arial" w:cs="Arial"/>
+          <w:sz w:val="24"/>
+          <w:szCs w:val="24"/>
+        </w:rPr>
+        <w:t xml:space="preserve"> se mantiene la mayor parte del tiempo por debajo de la línea de 16 ms (60 FPS), con picos puntuales.</w:t>
+      </w:r>
+      <w:r>
+        <w:rPr>
+          <w:rFonts w:ascii="Arial" w:hAnsi="Arial" w:cs="Arial"/>
+          <w:sz w:val="24"/>
+          <w:szCs w:val="24"/>
+        </w:rPr>
+        <w:br/>
+      </w:r>
+    </w:p>
+    <w:p>
+      <w:pPr>
+        <w:spacing w:line="360" w:lineRule="auto"/>
+        <w:rPr>
+          <w:rFonts w:ascii="Arial" w:hAnsi="Arial" w:cs="Arial"/>
+          <w:b/>
+          <w:bCs/>
           <w:i/>
           <w:iCs/>
-          <w:color w:val="555555"/>
-          <w:sz w:val="18"/>
-          <w:szCs w:val="18"/>
-        </w:rPr>
-        <w:t>Figura 4. Ventana Statistics en Play Mode.</w:t>
-      </w:r>
-    </w:p>
-    <w:p>
-      <w:pPr>
-        <w:spacing w:after="120" w:line="300" w:lineRule="auto"/>
-      </w:pPr>
-      <w:r>
-        <w:t>En el Profiler, el tiempo de CPU por frame se mantiene la mayor parte del tiempo por debajo de la línea de 16 ms (60 FPS), con picos puntuales.</w:t>
-      </w:r>
-    </w:p>
-    <w:p>
-      <w:pPr>
-        <w:spacing w:before="120" w:after="60"/>
-        <w:jc w:val="center"/>
-      </w:pPr>
-      <w:r>
-        <w:rPr>
+          <w:sz w:val="24"/>
+          <w:szCs w:val="24"/>
+        </w:rPr>
+      </w:pPr>
+      <w:r>
+        <w:rPr>
+          <w:rFonts w:ascii="Arial" w:hAnsi="Arial" w:cs="Arial"/>
+          <w:b/>
+          <w:bCs/>
+          <w:i/>
+          <w:iCs/>
+          <w:sz w:val="24"/>
+          <w:szCs w:val="24"/>
+        </w:rPr>
+        <w:t xml:space="preserve">Figura 5. </w:t>
+      </w:r>
+      <w:proofErr w:type="spellStart"/>
+      <w:r>
+        <w:rPr>
+          <w:rFonts w:ascii="Arial" w:hAnsi="Arial" w:cs="Arial"/>
+          <w:b/>
+          <w:bCs/>
+          <w:i/>
+          <w:iCs/>
+          <w:sz w:val="24"/>
+          <w:szCs w:val="24"/>
+        </w:rPr>
+        <w:t>Profiler</w:t>
+      </w:r>
+      <w:proofErr w:type="spellEnd"/>
+      <w:r>
+        <w:rPr>
+          <w:rFonts w:ascii="Arial" w:hAnsi="Arial" w:cs="Arial"/>
+          <w:b/>
+          <w:bCs/>
+          <w:i/>
+          <w:iCs/>
+          <w:sz w:val="24"/>
+          <w:szCs w:val="24"/>
+        </w:rPr>
+        <w:t xml:space="preserve"> en Play Mode (uso de CPU, render, memoria y audio).</w:t>
+      </w:r>
+    </w:p>
+    <w:p>
+      <w:pPr>
+        <w:spacing w:line="360" w:lineRule="auto"/>
+        <w:rPr>
+          <w:rFonts w:ascii="Arial" w:hAnsi="Arial" w:cs="Arial"/>
+          <w:b/>
+          <w:bCs/>
+          <w:sz w:val="24"/>
+          <w:szCs w:val="24"/>
+        </w:rPr>
+      </w:pPr>
+      <w:r>
+        <w:rPr>
+          <w:rFonts w:ascii="Arial" w:hAnsi="Arial" w:cs="Arial"/>
           <w:noProof/>
+          <w:sz w:val="24"/>
+          <w:szCs w:val="24"/>
         </w:rPr>
         <w:drawing>
-          <wp:inline distT="0" distB="0" distL="0" distR="0" wp14:anchorId="004C0544" wp14:editId="004C0545">
+          <wp:anchor distT="0" distB="0" distL="114300" distR="114300" simplePos="0" relativeHeight="251660288" behindDoc="0" locked="0" layoutInCell="1" allowOverlap="1" wp14:anchorId="004C0544" wp14:editId="7976D49A">
+            <wp:simplePos x="0" y="0"/>
+            <wp:positionH relativeFrom="margin">
+              <wp:align>center</wp:align>
+            </wp:positionH>
+            <wp:positionV relativeFrom="paragraph">
+              <wp:posOffset>3810</wp:posOffset>
+            </wp:positionV>
             <wp:extent cx="5581650" cy="3324225"/>
-            <wp:effectExtent l="0" t="0" r="0" b="0"/>
+            <wp:effectExtent l="0" t="0" r="0" b="9525"/>
+            <wp:wrapNone/>
             <wp:docPr id="5" name="Captura_Profiler.png" descr="Captura_Profiler.png" title="Captura_Profiler.png"/>
             <wp:cNvGraphicFramePr>
               <a:graphicFrameLocks xmlns:a="http://schemas.openxmlformats.org/drawingml/2006/main" noChangeAspect="1"/>
@@ -1022,7 +2993,13 @@
                     </pic:cNvPicPr>
                   </pic:nvPicPr>
                   <pic:blipFill>
-                    <a:blip r:embed="rId9"/>
+                    <a:blip r:embed="rId9" cstate="print">
+                      <a:extLst>
+                        <a:ext uri="{28A0092B-C50C-407E-A947-70E740481C1C}">
+                          <a14:useLocalDpi xmlns:a14="http://schemas.microsoft.com/office/drawing/2010/main" val="0"/>
+                        </a:ext>
+                      </a:extLst>
+                    </a:blip>
                     <a:srcRect/>
                     <a:stretch>
                       <a:fillRect/>
@@ -1040,98 +3017,596 @@
                 </pic:pic>
               </a:graphicData>
             </a:graphic>
-          </wp:inline>
+          </wp:anchor>
         </w:drawing>
       </w:r>
     </w:p>
     <w:p>
       <w:pPr>
-        <w:spacing w:after="200"/>
-        <w:jc w:val="center"/>
-      </w:pPr>
-      <w:r>
-        <w:rPr>
-          <w:i/>
-          <w:iCs/>
-          <w:color w:val="555555"/>
-          <w:sz w:val="18"/>
-          <w:szCs w:val="18"/>
-        </w:rPr>
-        <w:t>Figura 5. Profiler en Play Mode (uso de CPU, render, memoria y audio).</w:t>
-      </w:r>
-    </w:p>
-    <w:p>
-      <w:pPr>
-        <w:spacing w:after="120" w:line="300" w:lineRule="auto"/>
-      </w:pPr>
-      <w:r>
-        <w:rPr>
-          <w:b/>
-          <w:bCs/>
+        <w:spacing w:line="360" w:lineRule="auto"/>
+        <w:rPr>
+          <w:rFonts w:ascii="Arial" w:hAnsi="Arial" w:cs="Arial"/>
+          <w:b/>
+          <w:bCs/>
+          <w:sz w:val="24"/>
+          <w:szCs w:val="24"/>
+        </w:rPr>
+      </w:pPr>
+    </w:p>
+    <w:p>
+      <w:pPr>
+        <w:spacing w:line="360" w:lineRule="auto"/>
+        <w:rPr>
+          <w:rFonts w:ascii="Arial" w:hAnsi="Arial" w:cs="Arial"/>
+          <w:b/>
+          <w:bCs/>
+          <w:sz w:val="24"/>
+          <w:szCs w:val="24"/>
+        </w:rPr>
+      </w:pPr>
+    </w:p>
+    <w:p>
+      <w:pPr>
+        <w:spacing w:line="360" w:lineRule="auto"/>
+        <w:rPr>
+          <w:rFonts w:ascii="Arial" w:hAnsi="Arial" w:cs="Arial"/>
+          <w:b/>
+          <w:bCs/>
+          <w:sz w:val="24"/>
+          <w:szCs w:val="24"/>
+        </w:rPr>
+      </w:pPr>
+    </w:p>
+    <w:p>
+      <w:pPr>
+        <w:spacing w:line="360" w:lineRule="auto"/>
+        <w:rPr>
+          <w:rFonts w:ascii="Arial" w:hAnsi="Arial" w:cs="Arial"/>
+          <w:b/>
+          <w:bCs/>
+          <w:sz w:val="24"/>
+          <w:szCs w:val="24"/>
+        </w:rPr>
+      </w:pPr>
+    </w:p>
+    <w:p>
+      <w:pPr>
+        <w:spacing w:line="360" w:lineRule="auto"/>
+        <w:rPr>
+          <w:rFonts w:ascii="Arial" w:hAnsi="Arial" w:cs="Arial"/>
+          <w:b/>
+          <w:bCs/>
+          <w:sz w:val="24"/>
+          <w:szCs w:val="24"/>
+        </w:rPr>
+      </w:pPr>
+    </w:p>
+    <w:p>
+      <w:pPr>
+        <w:spacing w:line="360" w:lineRule="auto"/>
+        <w:rPr>
+          <w:rFonts w:ascii="Arial" w:hAnsi="Arial" w:cs="Arial"/>
+          <w:b/>
+          <w:bCs/>
+          <w:sz w:val="24"/>
+          <w:szCs w:val="24"/>
+        </w:rPr>
+      </w:pPr>
+    </w:p>
+    <w:p>
+      <w:pPr>
+        <w:spacing w:line="360" w:lineRule="auto"/>
+        <w:rPr>
+          <w:rFonts w:ascii="Arial" w:hAnsi="Arial" w:cs="Arial"/>
+          <w:b/>
+          <w:bCs/>
+          <w:sz w:val="24"/>
+          <w:szCs w:val="24"/>
+        </w:rPr>
+      </w:pPr>
+    </w:p>
+    <w:p>
+      <w:pPr>
+        <w:spacing w:line="360" w:lineRule="auto"/>
+        <w:rPr>
+          <w:rFonts w:ascii="Arial" w:hAnsi="Arial" w:cs="Arial"/>
+          <w:b/>
+          <w:bCs/>
+          <w:sz w:val="24"/>
+          <w:szCs w:val="24"/>
+        </w:rPr>
+      </w:pPr>
+    </w:p>
+    <w:p>
+      <w:pPr>
+        <w:spacing w:line="360" w:lineRule="auto"/>
+        <w:rPr>
+          <w:rFonts w:ascii="Arial" w:hAnsi="Arial" w:cs="Arial"/>
+          <w:b/>
+          <w:bCs/>
+          <w:sz w:val="24"/>
+          <w:szCs w:val="24"/>
+        </w:rPr>
+      </w:pPr>
+    </w:p>
+    <w:p>
+      <w:pPr>
+        <w:spacing w:line="360" w:lineRule="auto"/>
+        <w:rPr>
+          <w:rFonts w:ascii="Arial" w:hAnsi="Arial" w:cs="Arial"/>
+          <w:b/>
+          <w:bCs/>
+          <w:sz w:val="24"/>
+          <w:szCs w:val="24"/>
+        </w:rPr>
+      </w:pPr>
+    </w:p>
+    <w:p>
+      <w:pPr>
+        <w:spacing w:line="360" w:lineRule="auto"/>
+        <w:rPr>
+          <w:rFonts w:ascii="Arial" w:hAnsi="Arial" w:cs="Arial"/>
+          <w:b/>
+          <w:bCs/>
+          <w:sz w:val="24"/>
+          <w:szCs w:val="24"/>
+        </w:rPr>
+      </w:pPr>
+    </w:p>
+    <w:p>
+      <w:pPr>
+        <w:spacing w:line="360" w:lineRule="auto"/>
+        <w:rPr>
+          <w:rFonts w:ascii="Arial" w:hAnsi="Arial" w:cs="Arial"/>
+          <w:b/>
+          <w:bCs/>
+          <w:sz w:val="24"/>
+          <w:szCs w:val="24"/>
+        </w:rPr>
+      </w:pPr>
+    </w:p>
+    <w:p>
+      <w:pPr>
+        <w:spacing w:line="360" w:lineRule="auto"/>
+        <w:rPr>
+          <w:rFonts w:ascii="Arial" w:hAnsi="Arial" w:cs="Arial"/>
+          <w:sz w:val="24"/>
+          <w:szCs w:val="24"/>
+        </w:rPr>
+      </w:pPr>
+      <w:r>
+        <w:rPr>
+          <w:rFonts w:ascii="Arial" w:hAnsi="Arial" w:cs="Arial"/>
+          <w:b/>
+          <w:bCs/>
+          <w:sz w:val="24"/>
+          <w:szCs w:val="24"/>
         </w:rPr>
         <w:t xml:space="preserve">Alcance: </w:t>
       </w:r>
       <w:r>
-        <w:t>la medición se hizo en el Editor de una PC con RTX 4050 Laptop, sin visor. No es representativa de un Meta Quest; sirve como referencia relativa del costo de la escena.</w:t>
+        <w:rPr>
+          <w:rFonts w:ascii="Arial" w:hAnsi="Arial" w:cs="Arial"/>
+          <w:sz w:val="24"/>
+          <w:szCs w:val="24"/>
+        </w:rPr>
+        <w:t xml:space="preserve">la medición se hizo en el Editor de una </w:t>
+      </w:r>
+      <w:r>
+        <w:rPr>
+          <w:rFonts w:ascii="Arial" w:hAnsi="Arial" w:cs="Arial"/>
+          <w:sz w:val="24"/>
+          <w:szCs w:val="24"/>
+        </w:rPr>
+        <w:t>laptop</w:t>
+      </w:r>
+      <w:r>
+        <w:rPr>
+          <w:rFonts w:ascii="Arial" w:hAnsi="Arial" w:cs="Arial"/>
+          <w:sz w:val="24"/>
+          <w:szCs w:val="24"/>
+        </w:rPr>
+        <w:t xml:space="preserve"> con RTX 4050, sin visor. No es representativa de un Meta Quest; sirve como referencia relativa del costo de la escena.</w:t>
       </w:r>
     </w:p>
     <w:p>
       <w:pPr>
         <w:pStyle w:val="Ttulo1"/>
-        <w:spacing w:before="280" w:after="120"/>
-      </w:pPr>
-      <w:r>
-        <w:rPr>
-          <w:b/>
-          <w:bCs/>
-          <w:color w:val="1F3A4D"/>
-          <w:sz w:val="28"/>
-          <w:szCs w:val="28"/>
-        </w:rPr>
-        <w:t>5. Audio espacial</w:t>
-      </w:r>
-    </w:p>
-    <w:p>
-      <w:pPr>
-        <w:spacing w:after="120" w:line="300" w:lineRule="auto"/>
-      </w:pPr>
-      <w:r>
-        <w:t xml:space="preserve">El objeto Audio_Object (una radio sobre el aparador, junto a la pared este) tiene un Audio Source con Loop, Play On Awake, Spatial Blend = 1.0 (3D) y Logarithmic Rolloff con Min Distance 1 y Max </w:t>
-      </w:r>
-      <w:r>
+        <w:spacing w:line="360" w:lineRule="auto"/>
+        <w:rPr>
+          <w:rFonts w:ascii="Arial" w:hAnsi="Arial" w:cs="Arial"/>
+          <w:color w:val="auto"/>
+          <w:sz w:val="24"/>
+          <w:szCs w:val="24"/>
+        </w:rPr>
+      </w:pPr>
+      <w:r>
+        <w:rPr>
+          <w:rFonts w:ascii="Arial" w:hAnsi="Arial" w:cs="Arial"/>
+          <w:b/>
+          <w:bCs/>
+          <w:color w:val="auto"/>
+          <w:sz w:val="24"/>
+          <w:szCs w:val="24"/>
+        </w:rPr>
         <w:lastRenderedPageBreak/>
-        <w:t>Distance 15, ajustado al tamaño de la sala. Se añadió una Reverb Zone con el preset Room. El XR Origin lleva el único Audio Listener activo.</w:t>
-      </w:r>
-    </w:p>
-    <w:p>
-      <w:pPr>
-        <w:spacing w:after="120" w:line="300" w:lineRule="auto"/>
-      </w:pPr>
-      <w:r>
-        <w:rPr>
-          <w:b/>
-          <w:bCs/>
+        <w:t>5. AUDIO ESPACIAL</w:t>
+      </w:r>
+    </w:p>
+    <w:p>
+      <w:pPr>
+        <w:spacing w:line="360" w:lineRule="auto"/>
+        <w:rPr>
+          <w:rFonts w:ascii="Arial" w:hAnsi="Arial" w:cs="Arial"/>
+          <w:sz w:val="24"/>
+          <w:szCs w:val="24"/>
+        </w:rPr>
+      </w:pPr>
+      <w:r>
+        <w:rPr>
+          <w:rFonts w:ascii="Arial" w:hAnsi="Arial" w:cs="Arial"/>
+          <w:sz w:val="24"/>
+          <w:szCs w:val="24"/>
+        </w:rPr>
+        <w:t xml:space="preserve">El objeto </w:t>
+      </w:r>
+      <w:proofErr w:type="spellStart"/>
+      <w:r>
+        <w:rPr>
+          <w:rFonts w:ascii="Arial" w:hAnsi="Arial" w:cs="Arial"/>
+          <w:sz w:val="24"/>
+          <w:szCs w:val="24"/>
+        </w:rPr>
+        <w:t>Audio_Object</w:t>
+      </w:r>
+      <w:proofErr w:type="spellEnd"/>
+      <w:r>
+        <w:rPr>
+          <w:rFonts w:ascii="Arial" w:hAnsi="Arial" w:cs="Arial"/>
+          <w:sz w:val="24"/>
+          <w:szCs w:val="24"/>
+        </w:rPr>
+        <w:t xml:space="preserve"> (una radio sobre el aparador, junto a la pared este) tiene un Audio </w:t>
+      </w:r>
+      <w:proofErr w:type="spellStart"/>
+      <w:r>
+        <w:rPr>
+          <w:rFonts w:ascii="Arial" w:hAnsi="Arial" w:cs="Arial"/>
+          <w:sz w:val="24"/>
+          <w:szCs w:val="24"/>
+        </w:rPr>
+        <w:t>Source</w:t>
+      </w:r>
+      <w:proofErr w:type="spellEnd"/>
+      <w:r>
+        <w:rPr>
+          <w:rFonts w:ascii="Arial" w:hAnsi="Arial" w:cs="Arial"/>
+          <w:sz w:val="24"/>
+          <w:szCs w:val="24"/>
+        </w:rPr>
+        <w:t xml:space="preserve"> con Loop, Play </w:t>
+      </w:r>
+      <w:proofErr w:type="spellStart"/>
+      <w:r>
+        <w:rPr>
+          <w:rFonts w:ascii="Arial" w:hAnsi="Arial" w:cs="Arial"/>
+          <w:sz w:val="24"/>
+          <w:szCs w:val="24"/>
+        </w:rPr>
+        <w:t>On</w:t>
+      </w:r>
+      <w:proofErr w:type="spellEnd"/>
+      <w:r>
+        <w:rPr>
+          <w:rFonts w:ascii="Arial" w:hAnsi="Arial" w:cs="Arial"/>
+          <w:sz w:val="24"/>
+          <w:szCs w:val="24"/>
+        </w:rPr>
+        <w:t xml:space="preserve"> </w:t>
+      </w:r>
+      <w:proofErr w:type="spellStart"/>
+      <w:r>
+        <w:rPr>
+          <w:rFonts w:ascii="Arial" w:hAnsi="Arial" w:cs="Arial"/>
+          <w:sz w:val="24"/>
+          <w:szCs w:val="24"/>
+        </w:rPr>
+        <w:t>Awake</w:t>
+      </w:r>
+      <w:proofErr w:type="spellEnd"/>
+      <w:r>
+        <w:rPr>
+          <w:rFonts w:ascii="Arial" w:hAnsi="Arial" w:cs="Arial"/>
+          <w:sz w:val="24"/>
+          <w:szCs w:val="24"/>
+        </w:rPr>
+        <w:t xml:space="preserve">, </w:t>
+      </w:r>
+      <w:proofErr w:type="spellStart"/>
+      <w:r>
+        <w:rPr>
+          <w:rFonts w:ascii="Arial" w:hAnsi="Arial" w:cs="Arial"/>
+          <w:sz w:val="24"/>
+          <w:szCs w:val="24"/>
+        </w:rPr>
+        <w:t>Spatial</w:t>
+      </w:r>
+      <w:proofErr w:type="spellEnd"/>
+      <w:r>
+        <w:rPr>
+          <w:rFonts w:ascii="Arial" w:hAnsi="Arial" w:cs="Arial"/>
+          <w:sz w:val="24"/>
+          <w:szCs w:val="24"/>
+        </w:rPr>
+        <w:t xml:space="preserve"> Blend = 1.0 (3D) y </w:t>
+      </w:r>
+      <w:proofErr w:type="spellStart"/>
+      <w:r>
+        <w:rPr>
+          <w:rFonts w:ascii="Arial" w:hAnsi="Arial" w:cs="Arial"/>
+          <w:sz w:val="24"/>
+          <w:szCs w:val="24"/>
+        </w:rPr>
+        <w:t>Logarithmic</w:t>
+      </w:r>
+      <w:proofErr w:type="spellEnd"/>
+      <w:r>
+        <w:rPr>
+          <w:rFonts w:ascii="Arial" w:hAnsi="Arial" w:cs="Arial"/>
+          <w:sz w:val="24"/>
+          <w:szCs w:val="24"/>
+        </w:rPr>
+        <w:t xml:space="preserve"> Rolloff con Min Distance 1 y Max Distance 15, ajustado al tamaño de la sala. Se añadió una </w:t>
+      </w:r>
+      <w:proofErr w:type="spellStart"/>
+      <w:r>
+        <w:rPr>
+          <w:rFonts w:ascii="Arial" w:hAnsi="Arial" w:cs="Arial"/>
+          <w:sz w:val="24"/>
+          <w:szCs w:val="24"/>
+        </w:rPr>
+        <w:t>Reverb</w:t>
+      </w:r>
+      <w:proofErr w:type="spellEnd"/>
+      <w:r>
+        <w:rPr>
+          <w:rFonts w:ascii="Arial" w:hAnsi="Arial" w:cs="Arial"/>
+          <w:sz w:val="24"/>
+          <w:szCs w:val="24"/>
+        </w:rPr>
+        <w:t xml:space="preserve"> Zone con el </w:t>
+      </w:r>
+      <w:proofErr w:type="spellStart"/>
+      <w:r>
+        <w:rPr>
+          <w:rFonts w:ascii="Arial" w:hAnsi="Arial" w:cs="Arial"/>
+          <w:sz w:val="24"/>
+          <w:szCs w:val="24"/>
+        </w:rPr>
+        <w:t>preset</w:t>
+      </w:r>
+      <w:proofErr w:type="spellEnd"/>
+      <w:r>
+        <w:rPr>
+          <w:rFonts w:ascii="Arial" w:hAnsi="Arial" w:cs="Arial"/>
+          <w:sz w:val="24"/>
+          <w:szCs w:val="24"/>
+        </w:rPr>
+        <w:t xml:space="preserve"> Room. El XR </w:t>
+      </w:r>
+      <w:proofErr w:type="spellStart"/>
+      <w:r>
+        <w:rPr>
+          <w:rFonts w:ascii="Arial" w:hAnsi="Arial" w:cs="Arial"/>
+          <w:sz w:val="24"/>
+          <w:szCs w:val="24"/>
+        </w:rPr>
+        <w:t>Origin</w:t>
+      </w:r>
+      <w:proofErr w:type="spellEnd"/>
+      <w:r>
+        <w:rPr>
+          <w:rFonts w:ascii="Arial" w:hAnsi="Arial" w:cs="Arial"/>
+          <w:sz w:val="24"/>
+          <w:szCs w:val="24"/>
+        </w:rPr>
+        <w:t xml:space="preserve"> lleva el único Audio </w:t>
+      </w:r>
+      <w:proofErr w:type="spellStart"/>
+      <w:r>
+        <w:rPr>
+          <w:rFonts w:ascii="Arial" w:hAnsi="Arial" w:cs="Arial"/>
+          <w:sz w:val="24"/>
+          <w:szCs w:val="24"/>
+        </w:rPr>
+        <w:t>Listener</w:t>
+      </w:r>
+      <w:proofErr w:type="spellEnd"/>
+      <w:r>
+        <w:rPr>
+          <w:rFonts w:ascii="Arial" w:hAnsi="Arial" w:cs="Arial"/>
+          <w:sz w:val="24"/>
+          <w:szCs w:val="24"/>
+        </w:rPr>
+        <w:t xml:space="preserve"> activo.</w:t>
+      </w:r>
+    </w:p>
+    <w:p>
+      <w:pPr>
+        <w:spacing w:line="360" w:lineRule="auto"/>
+        <w:rPr>
+          <w:rFonts w:ascii="Arial" w:hAnsi="Arial" w:cs="Arial"/>
+          <w:sz w:val="24"/>
+          <w:szCs w:val="24"/>
+        </w:rPr>
+      </w:pPr>
+      <w:r>
+        <w:rPr>
+          <w:rFonts w:ascii="Arial" w:hAnsi="Arial" w:cs="Arial"/>
+          <w:b/>
+          <w:bCs/>
+          <w:sz w:val="24"/>
+          <w:szCs w:val="24"/>
         </w:rPr>
         <w:t xml:space="preserve">Limitación: </w:t>
       </w:r>
       <w:r>
-        <w:t>la guía menciona activar un plugin Spatializer (HRTF) en Project Settings. En este proyecto no hay ningún plugin de spatializer instalado (por ejemplo, Meta XR Audio), por lo que la dirección se percibe con el panning 3D estándar de Unity y no con HRTF. El Audio Source ya tiene la opción Spatialize activada para cuando se instale uno.</w:t>
+        <w:rPr>
+          <w:rFonts w:ascii="Arial" w:hAnsi="Arial" w:cs="Arial"/>
+          <w:sz w:val="24"/>
+          <w:szCs w:val="24"/>
+        </w:rPr>
+        <w:t xml:space="preserve">la guía menciona activar un plugin </w:t>
+      </w:r>
+      <w:proofErr w:type="spellStart"/>
+      <w:r>
+        <w:rPr>
+          <w:rFonts w:ascii="Arial" w:hAnsi="Arial" w:cs="Arial"/>
+          <w:sz w:val="24"/>
+          <w:szCs w:val="24"/>
+        </w:rPr>
+        <w:t>Spatializer</w:t>
+      </w:r>
+      <w:proofErr w:type="spellEnd"/>
+      <w:r>
+        <w:rPr>
+          <w:rFonts w:ascii="Arial" w:hAnsi="Arial" w:cs="Arial"/>
+          <w:sz w:val="24"/>
+          <w:szCs w:val="24"/>
+        </w:rPr>
+        <w:t xml:space="preserve"> (HRTF) en Project </w:t>
+      </w:r>
+      <w:proofErr w:type="spellStart"/>
+      <w:r>
+        <w:rPr>
+          <w:rFonts w:ascii="Arial" w:hAnsi="Arial" w:cs="Arial"/>
+          <w:sz w:val="24"/>
+          <w:szCs w:val="24"/>
+        </w:rPr>
+        <w:t>Settings</w:t>
+      </w:r>
+      <w:proofErr w:type="spellEnd"/>
+      <w:r>
+        <w:rPr>
+          <w:rFonts w:ascii="Arial" w:hAnsi="Arial" w:cs="Arial"/>
+          <w:sz w:val="24"/>
+          <w:szCs w:val="24"/>
+        </w:rPr>
+        <w:t xml:space="preserve">. En este proyecto no hay ningún plugin de </w:t>
+      </w:r>
+      <w:proofErr w:type="spellStart"/>
+      <w:r>
+        <w:rPr>
+          <w:rFonts w:ascii="Arial" w:hAnsi="Arial" w:cs="Arial"/>
+          <w:sz w:val="24"/>
+          <w:szCs w:val="24"/>
+        </w:rPr>
+        <w:t>spatializer</w:t>
+      </w:r>
+      <w:proofErr w:type="spellEnd"/>
+      <w:r>
+        <w:rPr>
+          <w:rFonts w:ascii="Arial" w:hAnsi="Arial" w:cs="Arial"/>
+          <w:sz w:val="24"/>
+          <w:szCs w:val="24"/>
+        </w:rPr>
+        <w:t xml:space="preserve"> instalado (por ejemplo, Meta XR Audio), por lo que la dirección se percibe con el </w:t>
+      </w:r>
+      <w:proofErr w:type="spellStart"/>
+      <w:r>
+        <w:rPr>
+          <w:rFonts w:ascii="Arial" w:hAnsi="Arial" w:cs="Arial"/>
+          <w:sz w:val="24"/>
+          <w:szCs w:val="24"/>
+        </w:rPr>
+        <w:t>panning</w:t>
+      </w:r>
+      <w:proofErr w:type="spellEnd"/>
+      <w:r>
+        <w:rPr>
+          <w:rFonts w:ascii="Arial" w:hAnsi="Arial" w:cs="Arial"/>
+          <w:sz w:val="24"/>
+          <w:szCs w:val="24"/>
+        </w:rPr>
+        <w:t xml:space="preserve"> 3D estándar de Unity y no con HRTF. El Audio </w:t>
+      </w:r>
+      <w:proofErr w:type="spellStart"/>
+      <w:r>
+        <w:rPr>
+          <w:rFonts w:ascii="Arial" w:hAnsi="Arial" w:cs="Arial"/>
+          <w:sz w:val="24"/>
+          <w:szCs w:val="24"/>
+        </w:rPr>
+        <w:t>Source</w:t>
+      </w:r>
+      <w:proofErr w:type="spellEnd"/>
+      <w:r>
+        <w:rPr>
+          <w:rFonts w:ascii="Arial" w:hAnsi="Arial" w:cs="Arial"/>
+          <w:sz w:val="24"/>
+          <w:szCs w:val="24"/>
+        </w:rPr>
+        <w:t xml:space="preserve"> ya tiene la opción </w:t>
+      </w:r>
+      <w:proofErr w:type="spellStart"/>
+      <w:r>
+        <w:rPr>
+          <w:rFonts w:ascii="Arial" w:hAnsi="Arial" w:cs="Arial"/>
+          <w:sz w:val="24"/>
+          <w:szCs w:val="24"/>
+        </w:rPr>
+        <w:t>Spatialize</w:t>
+      </w:r>
+      <w:proofErr w:type="spellEnd"/>
+      <w:r>
+        <w:rPr>
+          <w:rFonts w:ascii="Arial" w:hAnsi="Arial" w:cs="Arial"/>
+          <w:sz w:val="24"/>
+          <w:szCs w:val="24"/>
+        </w:rPr>
+        <w:t xml:space="preserve"> activada para cuando se instale uno.</w:t>
+      </w:r>
+      <w:r>
+        <w:rPr>
+          <w:rFonts w:ascii="Arial" w:hAnsi="Arial" w:cs="Arial"/>
+          <w:sz w:val="24"/>
+          <w:szCs w:val="24"/>
+        </w:rPr>
+        <w:br/>
       </w:r>
     </w:p>
     <w:p>
       <w:pPr>
         <w:pStyle w:val="Ttulo1"/>
-        <w:spacing w:before="280" w:after="120"/>
-      </w:pPr>
-      <w:r>
-        <w:rPr>
-          <w:b/>
-          <w:bCs/>
-          <w:color w:val="1F3A4D"/>
-          <w:sz w:val="28"/>
-          <w:szCs w:val="28"/>
-        </w:rPr>
-        <w:t>6. Evidencias entregadas</w:t>
+        <w:spacing w:line="360" w:lineRule="auto"/>
+        <w:rPr>
+          <w:rFonts w:ascii="Arial" w:hAnsi="Arial" w:cs="Arial"/>
+          <w:color w:val="auto"/>
+          <w:sz w:val="24"/>
+          <w:szCs w:val="24"/>
+        </w:rPr>
+      </w:pPr>
+      <w:r>
+        <w:rPr>
+          <w:rFonts w:ascii="Arial" w:hAnsi="Arial" w:cs="Arial"/>
+          <w:b/>
+          <w:bCs/>
+          <w:color w:val="auto"/>
+          <w:sz w:val="24"/>
+          <w:szCs w:val="24"/>
+        </w:rPr>
+        <w:t>6. EVIDENCIAS ENTREGADAS</w:t>
+      </w:r>
+      <w:r>
+        <w:rPr>
+          <w:rFonts w:ascii="Arial" w:hAnsi="Arial" w:cs="Arial"/>
+          <w:b/>
+          <w:bCs/>
+          <w:color w:val="auto"/>
+          <w:sz w:val="24"/>
+          <w:szCs w:val="24"/>
+        </w:rPr>
+        <w:br/>
       </w:r>
     </w:p>
     <w:tbl>
@@ -1148,8 +3623,8 @@
         <w:tblLook w:val="04A0" w:firstRow="1" w:lastRow="0" w:firstColumn="1" w:lastColumn="0" w:noHBand="0" w:noVBand="1"/>
       </w:tblPr>
       <w:tblGrid>
-        <w:gridCol w:w="2700"/>
-        <w:gridCol w:w="6326"/>
+        <w:gridCol w:w="2549"/>
+        <w:gridCol w:w="6477"/>
       </w:tblGrid>
       <w:tr>
         <w:tc>
@@ -1170,10 +3645,21 @@
             </w:tcMar>
           </w:tcPr>
           <w:p>
+            <w:pPr>
+              <w:spacing w:line="360" w:lineRule="auto"/>
+              <w:rPr>
+                <w:rFonts w:ascii="Arial" w:hAnsi="Arial" w:cs="Arial"/>
+                <w:sz w:val="24"/>
+                <w:szCs w:val="24"/>
+              </w:rPr>
+            </w:pPr>
             <w:r>
               <w:rPr>
+                <w:rFonts w:ascii="Arial" w:hAnsi="Arial" w:cs="Arial"/>
                 <w:b/>
                 <w:bCs/>
+                <w:sz w:val="24"/>
+                <w:szCs w:val="24"/>
               </w:rPr>
               <w:t>Capturas</w:t>
             </w:r>
@@ -1196,7 +3682,20 @@
             </w:tcMar>
           </w:tcPr>
           <w:p>
+            <w:pPr>
+              <w:spacing w:line="360" w:lineRule="auto"/>
+              <w:rPr>
+                <w:rFonts w:ascii="Arial" w:hAnsi="Arial" w:cs="Arial"/>
+                <w:sz w:val="24"/>
+                <w:szCs w:val="24"/>
+              </w:rPr>
+            </w:pPr>
             <w:r>
+              <w:rPr>
+                <w:rFonts w:ascii="Arial" w:hAnsi="Arial" w:cs="Arial"/>
+                <w:sz w:val="24"/>
+                <w:szCs w:val="24"/>
+              </w:rPr>
               <w:t>Figuras 1 a 5 de este reporte y carpeta Evidencias/ del repositorio</w:t>
             </w:r>
           </w:p>
@@ -1221,10 +3720,21 @@
             </w:tcMar>
           </w:tcPr>
           <w:p>
+            <w:pPr>
+              <w:spacing w:line="360" w:lineRule="auto"/>
+              <w:rPr>
+                <w:rFonts w:ascii="Arial" w:hAnsi="Arial" w:cs="Arial"/>
+                <w:sz w:val="24"/>
+                <w:szCs w:val="24"/>
+              </w:rPr>
+            </w:pPr>
             <w:r>
               <w:rPr>
+                <w:rFonts w:ascii="Arial" w:hAnsi="Arial" w:cs="Arial"/>
                 <w:b/>
                 <w:bCs/>
+                <w:sz w:val="24"/>
+                <w:szCs w:val="24"/>
               </w:rPr>
               <w:t>Video de navegación</w:t>
             </w:r>
@@ -1247,9 +3757,34 @@
             </w:tcMar>
           </w:tcPr>
           <w:p>
-            <w:r>
-              <w:t>Grabación 2026-10-07 090749.mp4 (recorrido con XR Device Simulator)</w:t>
-            </w:r>
+            <w:pPr>
+              <w:spacing w:line="360" w:lineRule="auto"/>
+              <w:rPr>
+                <w:rFonts w:ascii="Arial" w:hAnsi="Arial" w:cs="Arial"/>
+                <w:sz w:val="24"/>
+                <w:szCs w:val="24"/>
+              </w:rPr>
+            </w:pPr>
+            <w:hyperlink r:id="rId10" w:history="1">
+              <w:r>
+                <w:rPr>
+                  <w:rStyle w:val="Hipervnculo"/>
+                  <w:rFonts w:ascii="Arial" w:hAnsi="Arial" w:cs="Arial"/>
+                  <w:sz w:val="24"/>
+                  <w:szCs w:val="24"/>
+                </w:rPr>
+                <w:t>https://youtu.be/tKGmqLHH-</w:t>
+              </w:r>
+              <w:r>
+                <w:rPr>
+                  <w:rStyle w:val="Hipervnculo"/>
+                  <w:rFonts w:ascii="Arial" w:hAnsi="Arial" w:cs="Arial"/>
+                  <w:sz w:val="24"/>
+                  <w:szCs w:val="24"/>
+                </w:rPr>
+                <w:t>Ay</w:t>
+              </w:r>
+            </w:hyperlink>
           </w:p>
         </w:tc>
       </w:tr>
@@ -1272,10 +3807,21 @@
             </w:tcMar>
           </w:tcPr>
           <w:p>
+            <w:pPr>
+              <w:spacing w:line="360" w:lineRule="auto"/>
+              <w:rPr>
+                <w:rFonts w:ascii="Arial" w:hAnsi="Arial" w:cs="Arial"/>
+                <w:sz w:val="24"/>
+                <w:szCs w:val="24"/>
+              </w:rPr>
+            </w:pPr>
             <w:r>
               <w:rPr>
+                <w:rFonts w:ascii="Arial" w:hAnsi="Arial" w:cs="Arial"/>
                 <w:b/>
                 <w:bCs/>
+                <w:sz w:val="24"/>
+                <w:szCs w:val="24"/>
               </w:rPr>
               <w:t>Repositorio GitHub</w:t>
             </w:r>
@@ -1298,8 +3844,32 @@
             </w:tcMar>
           </w:tcPr>
           <w:p>
+            <w:pPr>
+              <w:spacing w:line="360" w:lineRule="auto"/>
+              <w:rPr>
+                <w:rFonts w:ascii="Arial" w:hAnsi="Arial" w:cs="Arial"/>
+                <w:sz w:val="24"/>
+                <w:szCs w:val="24"/>
+              </w:rPr>
+            </w:pPr>
+            <w:hyperlink r:id="rId11" w:history="1">
+              <w:r>
+                <w:rPr>
+                  <w:rStyle w:val="Hipervnculo"/>
+                  <w:rFonts w:ascii="Arial" w:hAnsi="Arial" w:cs="Arial"/>
+                  <w:sz w:val="24"/>
+                  <w:szCs w:val="24"/>
+                </w:rPr>
+                <w:t>https://github.com/EdwardPM05/Practica05_XR_Inmersion</w:t>
+              </w:r>
+            </w:hyperlink>
             <w:r>
-              <w:t>https://github.com/EdwardPM05/Practica05_XR_Inmersion (privado)</w:t>
+              <w:rPr>
+                <w:rFonts w:ascii="Arial" w:hAnsi="Arial" w:cs="Arial"/>
+                <w:sz w:val="24"/>
+                <w:szCs w:val="24"/>
+              </w:rPr>
+              <w:t xml:space="preserve"> </w:t>
             </w:r>
           </w:p>
         </w:tc>
@@ -1308,41 +3878,192 @@
     <w:p>
       <w:pPr>
         <w:pStyle w:val="Ttulo1"/>
-        <w:spacing w:before="280" w:after="120"/>
-      </w:pPr>
-      <w:r>
-        <w:rPr>
+        <w:spacing w:line="360" w:lineRule="auto"/>
+        <w:rPr>
+          <w:rFonts w:ascii="Arial" w:hAnsi="Arial" w:cs="Arial"/>
+          <w:sz w:val="24"/>
+          <w:szCs w:val="24"/>
+        </w:rPr>
+      </w:pPr>
+      <w:r>
+        <w:rPr>
+          <w:rFonts w:ascii="Arial" w:hAnsi="Arial" w:cs="Arial"/>
           <w:b/>
           <w:bCs/>
           <w:color w:val="1F3A4D"/>
-          <w:sz w:val="28"/>
-          <w:szCs w:val="28"/>
-        </w:rPr>
-        <w:t>7. Conclusión</w:t>
-      </w:r>
-    </w:p>
-    <w:p>
-      <w:pPr>
-        <w:spacing w:after="120" w:line="300" w:lineRule="auto"/>
-      </w:pPr>
-      <w:r>
-        <w:t>La combinación de geometría estática, luces Baked y lightmaps produjo una escena estable, sin parpadeos, con un costo de render bajo (alrededor de 200 FPS en PC) y un bake de poco más de 30 segundos con Progressive GPU. El audio 3D con atenuación logarítmica hace que el volumen y la dirección de la radio cambien con la posición del usuario, de modo que se puede ubicar la fuente aunque quede fuera del campo visual.</w:t>
-      </w:r>
-    </w:p>
-    <w:p>
-      <w:pPr>
-        <w:spacing w:after="120" w:line="300" w:lineRule="auto"/>
-      </w:pPr>
-      <w:r>
-        <w:t>[Agrega aquí tu opinión: ¿la iluminación y el audio ayudaron a sentir mayor presencia?]</w:t>
-      </w:r>
-    </w:p>
-    <w:p>
-      <w:pPr>
-        <w:spacing w:after="120" w:line="300" w:lineRule="auto"/>
-      </w:pPr>
-      <w:r>
-        <w:t>Como mejora queda instalar un spatializer HRTF y repetir la medición de FPS en un visor autónomo.</w:t>
+          <w:sz w:val="24"/>
+          <w:szCs w:val="24"/>
+        </w:rPr>
+        <w:br/>
+      </w:r>
+      <w:r>
+        <w:rPr>
+          <w:rFonts w:ascii="Arial" w:hAnsi="Arial" w:cs="Arial"/>
+          <w:b/>
+          <w:bCs/>
+          <w:color w:val="auto"/>
+          <w:sz w:val="24"/>
+          <w:szCs w:val="24"/>
+        </w:rPr>
+        <w:t>7. CONCLUSIÓN</w:t>
+      </w:r>
+    </w:p>
+    <w:p>
+      <w:pPr>
+        <w:spacing w:line="360" w:lineRule="auto"/>
+        <w:rPr>
+          <w:rFonts w:ascii="Arial" w:hAnsi="Arial" w:cs="Arial"/>
+          <w:sz w:val="24"/>
+          <w:szCs w:val="24"/>
+        </w:rPr>
+      </w:pPr>
+      <w:r>
+        <w:rPr>
+          <w:rFonts w:ascii="Arial" w:hAnsi="Arial" w:cs="Arial"/>
+          <w:sz w:val="24"/>
+          <w:szCs w:val="24"/>
+        </w:rPr>
+        <w:t xml:space="preserve">La combinación de geometría estática, luces </w:t>
+      </w:r>
+      <w:proofErr w:type="spellStart"/>
+      <w:r>
+        <w:rPr>
+          <w:rFonts w:ascii="Arial" w:hAnsi="Arial" w:cs="Arial"/>
+          <w:sz w:val="24"/>
+          <w:szCs w:val="24"/>
+        </w:rPr>
+        <w:t>Baked</w:t>
+      </w:r>
+      <w:proofErr w:type="spellEnd"/>
+      <w:r>
+        <w:rPr>
+          <w:rFonts w:ascii="Arial" w:hAnsi="Arial" w:cs="Arial"/>
+          <w:sz w:val="24"/>
+          <w:szCs w:val="24"/>
+        </w:rPr>
+        <w:t xml:space="preserve"> y </w:t>
+      </w:r>
+      <w:proofErr w:type="spellStart"/>
+      <w:r>
+        <w:rPr>
+          <w:rFonts w:ascii="Arial" w:hAnsi="Arial" w:cs="Arial"/>
+          <w:sz w:val="24"/>
+          <w:szCs w:val="24"/>
+        </w:rPr>
+        <w:t>lightmaps</w:t>
+      </w:r>
+      <w:proofErr w:type="spellEnd"/>
+      <w:r>
+        <w:rPr>
+          <w:rFonts w:ascii="Arial" w:hAnsi="Arial" w:cs="Arial"/>
+          <w:sz w:val="24"/>
+          <w:szCs w:val="24"/>
+        </w:rPr>
+        <w:t xml:space="preserve"> produjo una escena estable, sin parpadeos, con un costo de render bajo (alrededor de 200 FPS en PC) y un </w:t>
+      </w:r>
+      <w:proofErr w:type="spellStart"/>
+      <w:r>
+        <w:rPr>
+          <w:rFonts w:ascii="Arial" w:hAnsi="Arial" w:cs="Arial"/>
+          <w:sz w:val="24"/>
+          <w:szCs w:val="24"/>
+        </w:rPr>
+        <w:t>bake</w:t>
+      </w:r>
+      <w:proofErr w:type="spellEnd"/>
+      <w:r>
+        <w:rPr>
+          <w:rFonts w:ascii="Arial" w:hAnsi="Arial" w:cs="Arial"/>
+          <w:sz w:val="24"/>
+          <w:szCs w:val="24"/>
+        </w:rPr>
+        <w:t xml:space="preserve"> de poco más de 30 segundos con </w:t>
+      </w:r>
+      <w:proofErr w:type="spellStart"/>
+      <w:r>
+        <w:rPr>
+          <w:rFonts w:ascii="Arial" w:hAnsi="Arial" w:cs="Arial"/>
+          <w:sz w:val="24"/>
+          <w:szCs w:val="24"/>
+        </w:rPr>
+        <w:t>Progressive</w:t>
+      </w:r>
+      <w:proofErr w:type="spellEnd"/>
+      <w:r>
+        <w:rPr>
+          <w:rFonts w:ascii="Arial" w:hAnsi="Arial" w:cs="Arial"/>
+          <w:sz w:val="24"/>
+          <w:szCs w:val="24"/>
+        </w:rPr>
+        <w:t xml:space="preserve"> GPU. El audio 3D </w:t>
+      </w:r>
+      <w:r>
+        <w:rPr>
+          <w:rFonts w:ascii="Arial" w:hAnsi="Arial" w:cs="Arial"/>
+          <w:sz w:val="24"/>
+          <w:szCs w:val="24"/>
+        </w:rPr>
+        <w:t xml:space="preserve">reactivo hace que la inmersión sea mas viva con respecto al usuario ya que </w:t>
+      </w:r>
+      <w:r>
+        <w:rPr>
+          <w:rFonts w:ascii="Arial" w:hAnsi="Arial" w:cs="Arial"/>
+          <w:sz w:val="24"/>
+          <w:szCs w:val="24"/>
+        </w:rPr>
+        <w:t>imita el odio humano al jugar con la distancia entre el objeto emisor y el personaje</w:t>
+      </w:r>
+      <w:r>
+        <w:rPr>
+          <w:rFonts w:ascii="Arial" w:hAnsi="Arial" w:cs="Arial"/>
+          <w:sz w:val="24"/>
+          <w:szCs w:val="24"/>
+        </w:rPr>
+        <w:t>, ya que entre mas cerca se encuentre</w:t>
+      </w:r>
+      <w:r>
+        <w:rPr>
+          <w:rFonts w:ascii="Arial" w:hAnsi="Arial" w:cs="Arial"/>
+          <w:sz w:val="24"/>
+          <w:szCs w:val="24"/>
+        </w:rPr>
+        <w:t>, mas fuerte sonara el sonido y viceversa.</w:t>
+      </w:r>
+    </w:p>
+    <w:p>
+      <w:pPr>
+        <w:spacing w:line="360" w:lineRule="auto"/>
+        <w:rPr>
+          <w:rFonts w:ascii="Arial" w:hAnsi="Arial" w:cs="Arial"/>
+          <w:sz w:val="24"/>
+          <w:szCs w:val="24"/>
+        </w:rPr>
+      </w:pPr>
+      <w:r>
+        <w:rPr>
+          <w:rFonts w:ascii="Arial" w:hAnsi="Arial" w:cs="Arial"/>
+          <w:sz w:val="24"/>
+          <w:szCs w:val="24"/>
+        </w:rPr>
+        <w:t xml:space="preserve">Como mejora queda instalar un </w:t>
+      </w:r>
+      <w:proofErr w:type="spellStart"/>
+      <w:r>
+        <w:rPr>
+          <w:rFonts w:ascii="Arial" w:hAnsi="Arial" w:cs="Arial"/>
+          <w:sz w:val="24"/>
+          <w:szCs w:val="24"/>
+        </w:rPr>
+        <w:t>spatializer</w:t>
+      </w:r>
+      <w:proofErr w:type="spellEnd"/>
+      <w:r>
+        <w:rPr>
+          <w:rFonts w:ascii="Arial" w:hAnsi="Arial" w:cs="Arial"/>
+          <w:sz w:val="24"/>
+          <w:szCs w:val="24"/>
+        </w:rPr>
+        <w:t xml:space="preserve"> HRTF y repetir la medición de FPS en un visor autónomo.</w:t>
       </w:r>
     </w:p>
     <w:sectPr>
@@ -2000,7 +4721,6 @@
   <w:style w:type="character" w:default="1" w:styleId="Fuentedeprrafopredeter">
     <w:name w:val="Default Paragraph Font"/>
     <w:uiPriority w:val="1"/>
-    <w:semiHidden/>
     <w:unhideWhenUsed/>
   </w:style>
   <w:style w:type="table" w:default="1" w:styleId="Tablanormal">
@@ -2121,6 +4841,18 @@
     <w:rPr>
       <w:sz w:val="20"/>
       <w:szCs w:val="20"/>
+    </w:rPr>
+  </w:style>
+  <w:style w:type="character" w:styleId="Mencinsinresolver">
+    <w:name w:val="Unresolved Mention"/>
+    <w:basedOn w:val="Fuentedeprrafopredeter"/>
+    <w:uiPriority w:val="99"/>
+    <w:semiHidden/>
+    <w:unhideWhenUsed/>
+    <w:rsid w:val="00366029"/>
+    <w:rPr>
+      <w:color w:val="605E5C"/>
+      <w:shd w:val="clear" w:color="auto" w:fill="E1DFDD"/>
     </w:rPr>
   </w:style>
 </w:styles>

</xml_diff>